<commit_message>
docs: update use case review SOP
</commit_message>
<xml_diff>
--- a/documentation/Use Case Review Standard Operating Procedure/Use Case Review Standard Operating Procedure.docx
+++ b/documentation/Use Case Review Standard Operating Procedure/Use Case Review Standard Operating Procedure.docx
@@ -116,9 +116,46 @@
           <w:sz w:val="18"/>
           <w:szCs w:val="18"/>
         </w:rPr>
-        <w:t xml:space="preserve">RSOP) standardises the process a Quality Manager takes when reviewing a usecase. The goal of a quality review is to assess the usecase against the </w:t>
+        <w:t xml:space="preserve">RSOP) standardises the process a Quality Manager takes when reviewing a </w:t>
+      </w:r>
+      <w:proofErr w:type="spellStart"/>
+      <w:r>
+        <w:rPr>
+          <w:rFonts w:asciiTheme="majorHAnsi" w:eastAsiaTheme="majorEastAsia" w:hAnsiTheme="majorHAnsi"/>
+          <w:sz w:val="18"/>
+          <w:szCs w:val="18"/>
+        </w:rPr>
+        <w:t>usecase</w:t>
+      </w:r>
+      <w:proofErr w:type="spellEnd"/>
+      <w:r>
+        <w:rPr>
+          <w:rFonts w:asciiTheme="majorHAnsi" w:eastAsiaTheme="majorEastAsia" w:hAnsiTheme="majorHAnsi"/>
+          <w:sz w:val="18"/>
+          <w:szCs w:val="18"/>
+        </w:rPr>
+        <w:t xml:space="preserve">. The goal of a quality review is to assess the </w:t>
+      </w:r>
+      <w:proofErr w:type="spellStart"/>
+      <w:r>
+        <w:rPr>
+          <w:rFonts w:asciiTheme="majorHAnsi" w:eastAsiaTheme="majorEastAsia" w:hAnsiTheme="majorHAnsi"/>
+          <w:sz w:val="18"/>
+          <w:szCs w:val="18"/>
+        </w:rPr>
+        <w:t>usecase</w:t>
+      </w:r>
+      <w:proofErr w:type="spellEnd"/>
+      <w:r>
+        <w:rPr>
+          <w:rFonts w:asciiTheme="majorHAnsi" w:eastAsiaTheme="majorEastAsia" w:hAnsiTheme="majorHAnsi"/>
+          <w:sz w:val="18"/>
+          <w:szCs w:val="18"/>
+        </w:rPr>
+        <w:t xml:space="preserve"> against the </w:t>
       </w:r>
       <w:hyperlink r:id="rId8">
+        <w:proofErr w:type="spellStart"/>
         <w:r>
           <w:rPr>
             <w:rStyle w:val="Hyperlink"/>
@@ -126,7 +163,17 @@
             <w:sz w:val="18"/>
             <w:szCs w:val="18"/>
           </w:rPr>
-          <w:t>Usecase Quality Tracker</w:t>
+          <w:t>Usecase</w:t>
+        </w:r>
+        <w:proofErr w:type="spellEnd"/>
+        <w:r>
+          <w:rPr>
+            <w:rStyle w:val="Hyperlink"/>
+            <w:rFonts w:asciiTheme="majorHAnsi" w:eastAsiaTheme="majorEastAsia" w:hAnsiTheme="majorHAnsi"/>
+            <w:sz w:val="18"/>
+            <w:szCs w:val="18"/>
+          </w:rPr>
+          <w:t xml:space="preserve"> Quality Tracker</w:t>
         </w:r>
       </w:hyperlink>
       <w:r>
@@ -153,7 +200,25 @@
           <w:sz w:val="18"/>
           <w:szCs w:val="18"/>
         </w:rPr>
-        <w:t xml:space="preserve">For the definition and purpose of a usecase, refer to the section </w:t>
+        <w:t xml:space="preserve">For the definition and purpose of a </w:t>
+      </w:r>
+      <w:proofErr w:type="spellStart"/>
+      <w:r>
+        <w:rPr>
+          <w:rFonts w:asciiTheme="majorHAnsi" w:eastAsiaTheme="majorEastAsia" w:hAnsiTheme="majorHAnsi"/>
+          <w:sz w:val="18"/>
+          <w:szCs w:val="18"/>
+        </w:rPr>
+        <w:t>usecase</w:t>
+      </w:r>
+      <w:proofErr w:type="spellEnd"/>
+      <w:r>
+        <w:rPr>
+          <w:rFonts w:asciiTheme="majorHAnsi" w:eastAsiaTheme="majorEastAsia" w:hAnsiTheme="majorHAnsi"/>
+          <w:sz w:val="18"/>
+          <w:szCs w:val="18"/>
+        </w:rPr>
+        <w:t xml:space="preserve">, refer to the section </w:t>
       </w:r>
       <w:r>
         <w:rPr>
@@ -163,7 +228,29 @@
           <w:sz w:val="18"/>
           <w:szCs w:val="18"/>
         </w:rPr>
-        <w:t>“What do we mean when we say ‘usecase’</w:t>
+        <w:t>“What do we mean when we say ‘</w:t>
+      </w:r>
+      <w:proofErr w:type="spellStart"/>
+      <w:r>
+        <w:rPr>
+          <w:rFonts w:asciiTheme="majorHAnsi" w:eastAsiaTheme="majorEastAsia" w:hAnsiTheme="majorHAnsi"/>
+          <w:b/>
+          <w:bCs/>
+          <w:sz w:val="18"/>
+          <w:szCs w:val="18"/>
+        </w:rPr>
+        <w:t>usecase</w:t>
+      </w:r>
+      <w:proofErr w:type="spellEnd"/>
+      <w:r>
+        <w:rPr>
+          <w:rFonts w:asciiTheme="majorHAnsi" w:eastAsiaTheme="majorEastAsia" w:hAnsiTheme="majorHAnsi"/>
+          <w:b/>
+          <w:bCs/>
+          <w:sz w:val="18"/>
+          <w:szCs w:val="18"/>
+        </w:rPr>
+        <w:t>’</w:t>
       </w:r>
       <w:r>
         <w:rPr>
@@ -190,7 +277,53 @@
           <w:sz w:val="18"/>
           <w:szCs w:val="18"/>
         </w:rPr>
-        <w:t>. In summary, a usecase is an interactive .ipynb notebook tutorial that uses open data to address real-world problems, adding value and explaining how the data is analysed at each step so others can apply similar approaches.</w:t>
+        <w:t xml:space="preserve">. In summary, a </w:t>
+      </w:r>
+      <w:proofErr w:type="spellStart"/>
+      <w:r>
+        <w:rPr>
+          <w:rFonts w:asciiTheme="majorHAnsi" w:eastAsiaTheme="majorEastAsia" w:hAnsiTheme="majorHAnsi"/>
+          <w:sz w:val="18"/>
+          <w:szCs w:val="18"/>
+        </w:rPr>
+        <w:t>usecase</w:t>
+      </w:r>
+      <w:proofErr w:type="spellEnd"/>
+      <w:r>
+        <w:rPr>
+          <w:rFonts w:asciiTheme="majorHAnsi" w:eastAsiaTheme="majorEastAsia" w:hAnsiTheme="majorHAnsi"/>
+          <w:sz w:val="18"/>
+          <w:szCs w:val="18"/>
+        </w:rPr>
+        <w:t xml:space="preserve"> is an </w:t>
+      </w:r>
+      <w:proofErr w:type="gramStart"/>
+      <w:r>
+        <w:rPr>
+          <w:rFonts w:asciiTheme="majorHAnsi" w:eastAsiaTheme="majorEastAsia" w:hAnsiTheme="majorHAnsi"/>
+          <w:sz w:val="18"/>
+          <w:szCs w:val="18"/>
+        </w:rPr>
+        <w:t>interactive .</w:t>
+      </w:r>
+      <w:proofErr w:type="spellStart"/>
+      <w:r>
+        <w:rPr>
+          <w:rFonts w:asciiTheme="majorHAnsi" w:eastAsiaTheme="majorEastAsia" w:hAnsiTheme="majorHAnsi"/>
+          <w:sz w:val="18"/>
+          <w:szCs w:val="18"/>
+        </w:rPr>
+        <w:t>ipynb</w:t>
+      </w:r>
+      <w:proofErr w:type="spellEnd"/>
+      <w:proofErr w:type="gramEnd"/>
+      <w:r>
+        <w:rPr>
+          <w:rFonts w:asciiTheme="majorHAnsi" w:eastAsiaTheme="majorEastAsia" w:hAnsiTheme="majorHAnsi"/>
+          <w:sz w:val="18"/>
+          <w:szCs w:val="18"/>
+        </w:rPr>
+        <w:t xml:space="preserve"> notebook tutorial that uses open data to address real-world problems, adding value and explaining how the data is analysed at each step so others can apply similar approaches.</w:t>
       </w:r>
     </w:p>
     <w:p>
@@ -224,7 +357,61 @@
           <w:sz w:val="18"/>
           <w:szCs w:val="18"/>
         </w:rPr>
-        <w:t>RSOP steps through the process of reviewing a usecase from beginning to end, from selecting a usecase, undertaking the review, providing the detailed outcome of the review, and creating the MS Planner card with the steps needed to update the usecase. It is important to follow these steps so that all quality reviews are consistent and evidence</w:t>
+        <w:t xml:space="preserve">RSOP steps through the process of reviewing a </w:t>
+      </w:r>
+      <w:proofErr w:type="spellStart"/>
+      <w:r>
+        <w:rPr>
+          <w:rFonts w:asciiTheme="majorHAnsi" w:eastAsiaTheme="majorEastAsia" w:hAnsiTheme="majorHAnsi"/>
+          <w:sz w:val="18"/>
+          <w:szCs w:val="18"/>
+        </w:rPr>
+        <w:t>usecase</w:t>
+      </w:r>
+      <w:proofErr w:type="spellEnd"/>
+      <w:r>
+        <w:rPr>
+          <w:rFonts w:asciiTheme="majorHAnsi" w:eastAsiaTheme="majorEastAsia" w:hAnsiTheme="majorHAnsi"/>
+          <w:sz w:val="18"/>
+          <w:szCs w:val="18"/>
+        </w:rPr>
+        <w:t xml:space="preserve"> from beginning to end, from selecting a </w:t>
+      </w:r>
+      <w:proofErr w:type="spellStart"/>
+      <w:r>
+        <w:rPr>
+          <w:rFonts w:asciiTheme="majorHAnsi" w:eastAsiaTheme="majorEastAsia" w:hAnsiTheme="majorHAnsi"/>
+          <w:sz w:val="18"/>
+          <w:szCs w:val="18"/>
+        </w:rPr>
+        <w:t>usecase</w:t>
+      </w:r>
+      <w:proofErr w:type="spellEnd"/>
+      <w:r>
+        <w:rPr>
+          <w:rFonts w:asciiTheme="majorHAnsi" w:eastAsiaTheme="majorEastAsia" w:hAnsiTheme="majorHAnsi"/>
+          <w:sz w:val="18"/>
+          <w:szCs w:val="18"/>
+        </w:rPr>
+        <w:t xml:space="preserve">, undertaking the review, providing the detailed outcome of the review, and creating the MS Planner card with the steps needed to update the </w:t>
+      </w:r>
+      <w:proofErr w:type="spellStart"/>
+      <w:r>
+        <w:rPr>
+          <w:rFonts w:asciiTheme="majorHAnsi" w:eastAsiaTheme="majorEastAsia" w:hAnsiTheme="majorHAnsi"/>
+          <w:sz w:val="18"/>
+          <w:szCs w:val="18"/>
+        </w:rPr>
+        <w:t>usecase</w:t>
+      </w:r>
+      <w:proofErr w:type="spellEnd"/>
+      <w:r>
+        <w:rPr>
+          <w:rFonts w:asciiTheme="majorHAnsi" w:eastAsiaTheme="majorEastAsia" w:hAnsiTheme="majorHAnsi"/>
+          <w:sz w:val="18"/>
+          <w:szCs w:val="18"/>
+        </w:rPr>
+        <w:t>. It is important to follow these steps so that all quality reviews are consistent and evidence</w:t>
       </w:r>
       <w:r>
         <w:rPr>
@@ -266,12 +453,30 @@
           <w:sz w:val="18"/>
           <w:szCs w:val="18"/>
         </w:rPr>
-        <w:t xml:space="preserve">The checklist (sheet ‘QA Checklist V2’) is one row per usecase. Complete each column as you move across. The table below explains in more detail what you should be looking for in each column. </w:t>
+        <w:t xml:space="preserve">The checklist (sheet ‘QA Checklist V2’) is one row per </w:t>
+      </w:r>
+      <w:proofErr w:type="spellStart"/>
+      <w:r>
+        <w:rPr>
+          <w:rFonts w:asciiTheme="majorHAnsi" w:eastAsiaTheme="majorEastAsia" w:hAnsiTheme="majorHAnsi"/>
+          <w:sz w:val="18"/>
+          <w:szCs w:val="18"/>
+        </w:rPr>
+        <w:t>usecase</w:t>
+      </w:r>
+      <w:proofErr w:type="spellEnd"/>
+      <w:r>
+        <w:rPr>
+          <w:rFonts w:asciiTheme="majorHAnsi" w:eastAsiaTheme="majorEastAsia" w:hAnsiTheme="majorHAnsi"/>
+          <w:sz w:val="18"/>
+          <w:szCs w:val="18"/>
+        </w:rPr>
+        <w:t xml:space="preserve">. Complete each column as you move across. The table below explains in more detail what you should be looking for in each column. </w:t>
       </w:r>
     </w:p>
     <w:tbl>
       <w:tblPr>
-        <w:tblW w:w="10066" w:type="dxa"/>
+        <w:tblW w:w="9351" w:type="dxa"/>
         <w:tblBorders>
           <w:top w:val="single" w:sz="4" w:space="0" w:color="B7C9D6"/>
           <w:left w:val="single" w:sz="4" w:space="0" w:color="B7C9D6"/>
@@ -286,7 +491,7 @@
       <w:tblGrid>
         <w:gridCol w:w="2263"/>
         <w:gridCol w:w="3828"/>
-        <w:gridCol w:w="3975"/>
+        <w:gridCol w:w="3260"/>
       </w:tblGrid>
       <w:tr>
         <w:trPr>
@@ -361,7 +566,7 @@
         </w:tc>
         <w:tc>
           <w:tcPr>
-            <w:tcW w:w="3975" w:type="dxa"/>
+            <w:tcW w:w="3260" w:type="dxa"/>
             <w:shd w:val="clear" w:color="auto" w:fill="1F4E78"/>
             <w:tcMar>
               <w:top w:w="90" w:type="dxa"/>
@@ -420,14 +625,25 @@
                 <w:szCs w:val="18"/>
               </w:rPr>
             </w:pPr>
-            <w:r>
-              <w:rPr>
-                <w:rFonts w:asciiTheme="minorHAnsi" w:eastAsiaTheme="majorEastAsia" w:hAnsiTheme="minorHAnsi"/>
-                <w:color w:val="auto"/>
-                <w:sz w:val="18"/>
-                <w:szCs w:val="18"/>
-              </w:rPr>
-              <w:t>usecase code</w:t>
+            <w:proofErr w:type="spellStart"/>
+            <w:r>
+              <w:rPr>
+                <w:rFonts w:asciiTheme="minorHAnsi" w:eastAsiaTheme="majorEastAsia" w:hAnsiTheme="minorHAnsi"/>
+                <w:color w:val="auto"/>
+                <w:sz w:val="18"/>
+                <w:szCs w:val="18"/>
+              </w:rPr>
+              <w:t>usecase</w:t>
+            </w:r>
+            <w:proofErr w:type="spellEnd"/>
+            <w:r>
+              <w:rPr>
+                <w:rFonts w:asciiTheme="minorHAnsi" w:eastAsiaTheme="majorEastAsia" w:hAnsiTheme="minorHAnsi"/>
+                <w:color w:val="auto"/>
+                <w:sz w:val="18"/>
+                <w:szCs w:val="18"/>
+              </w:rPr>
+              <w:t xml:space="preserve"> code</w:t>
             </w:r>
           </w:p>
         </w:tc>
@@ -465,7 +681,7 @@
         </w:tc>
         <w:tc>
           <w:tcPr>
-            <w:tcW w:w="3975" w:type="dxa"/>
+            <w:tcW w:w="3260" w:type="dxa"/>
             <w:shd w:val="clear" w:color="auto" w:fill="FFFFFF" w:themeFill="background1"/>
             <w:tcMar>
               <w:top w:w="90" w:type="dxa"/>
@@ -522,14 +738,25 @@
                 <w:szCs w:val="18"/>
               </w:rPr>
             </w:pPr>
-            <w:r>
-              <w:rPr>
-                <w:rFonts w:asciiTheme="minorHAnsi" w:eastAsiaTheme="majorEastAsia" w:hAnsiTheme="minorHAnsi"/>
-                <w:color w:val="auto"/>
-                <w:sz w:val="18"/>
-                <w:szCs w:val="18"/>
-              </w:rPr>
-              <w:t>usecase name</w:t>
+            <w:proofErr w:type="spellStart"/>
+            <w:r>
+              <w:rPr>
+                <w:rFonts w:asciiTheme="minorHAnsi" w:eastAsiaTheme="majorEastAsia" w:hAnsiTheme="minorHAnsi"/>
+                <w:color w:val="auto"/>
+                <w:sz w:val="18"/>
+                <w:szCs w:val="18"/>
+              </w:rPr>
+              <w:t>usecase</w:t>
+            </w:r>
+            <w:proofErr w:type="spellEnd"/>
+            <w:r>
+              <w:rPr>
+                <w:rFonts w:asciiTheme="minorHAnsi" w:eastAsiaTheme="majorEastAsia" w:hAnsiTheme="minorHAnsi"/>
+                <w:color w:val="auto"/>
+                <w:sz w:val="18"/>
+                <w:szCs w:val="18"/>
+              </w:rPr>
+              <w:t xml:space="preserve"> name</w:t>
             </w:r>
           </w:p>
         </w:tc>
@@ -561,13 +788,33 @@
                 <w:sz w:val="18"/>
                 <w:szCs w:val="18"/>
               </w:rPr>
-              <w:t>Record the notebook’s published name and check whether it matches the title within the use case. Make sure the usecase code is at the start of the file name.</w:t>
+              <w:t xml:space="preserve">Record the notebook’s published name and check whether it matches the title within the use case. Make sure the </w:t>
+            </w:r>
+            <w:proofErr w:type="spellStart"/>
+            <w:r>
+              <w:rPr>
+                <w:rFonts w:asciiTheme="minorHAnsi" w:eastAsiaTheme="majorEastAsia" w:hAnsiTheme="minorHAnsi"/>
+                <w:color w:val="auto"/>
+                <w:sz w:val="18"/>
+                <w:szCs w:val="18"/>
+              </w:rPr>
+              <w:t>usecase</w:t>
+            </w:r>
+            <w:proofErr w:type="spellEnd"/>
+            <w:r>
+              <w:rPr>
+                <w:rFonts w:asciiTheme="minorHAnsi" w:eastAsiaTheme="majorEastAsia" w:hAnsiTheme="minorHAnsi"/>
+                <w:color w:val="auto"/>
+                <w:sz w:val="18"/>
+                <w:szCs w:val="18"/>
+              </w:rPr>
+              <w:t xml:space="preserve"> code is at the start of the file name.</w:t>
             </w:r>
           </w:p>
         </w:tc>
         <w:tc>
           <w:tcPr>
-            <w:tcW w:w="3975" w:type="dxa"/>
+            <w:tcW w:w="3260" w:type="dxa"/>
             <w:shd w:val="clear" w:color="auto" w:fill="F7F9FB"/>
             <w:tcMar>
               <w:top w:w="90" w:type="dxa"/>
@@ -662,7 +909,47 @@
                 <w:sz w:val="18"/>
                 <w:szCs w:val="18"/>
               </w:rPr>
-              <w:t xml:space="preserve">Select the domain that best represents the main problem, intended outcome, and datasets of the usecase. If a usecase fits into multiple domains, select the domain most directly addressed by its scenario and analysis. Refer to </w:t>
+              <w:t xml:space="preserve">Select the domain that best represents the main problem, intended outcome, and datasets of the </w:t>
+            </w:r>
+            <w:proofErr w:type="spellStart"/>
+            <w:r>
+              <w:rPr>
+                <w:rFonts w:asciiTheme="minorHAnsi" w:eastAsia="Aptos Display" w:hAnsiTheme="minorHAnsi" w:cs="Aptos Display"/>
+                <w:color w:val="auto"/>
+                <w:sz w:val="18"/>
+                <w:szCs w:val="18"/>
+              </w:rPr>
+              <w:t>usecase</w:t>
+            </w:r>
+            <w:proofErr w:type="spellEnd"/>
+            <w:r>
+              <w:rPr>
+                <w:rFonts w:asciiTheme="minorHAnsi" w:eastAsia="Aptos Display" w:hAnsiTheme="minorHAnsi" w:cs="Aptos Display"/>
+                <w:color w:val="auto"/>
+                <w:sz w:val="18"/>
+                <w:szCs w:val="18"/>
+              </w:rPr>
+              <w:t xml:space="preserve">. If a </w:t>
+            </w:r>
+            <w:proofErr w:type="spellStart"/>
+            <w:r>
+              <w:rPr>
+                <w:rFonts w:asciiTheme="minorHAnsi" w:eastAsia="Aptos Display" w:hAnsiTheme="minorHAnsi" w:cs="Aptos Display"/>
+                <w:color w:val="auto"/>
+                <w:sz w:val="18"/>
+                <w:szCs w:val="18"/>
+              </w:rPr>
+              <w:t>usecase</w:t>
+            </w:r>
+            <w:proofErr w:type="spellEnd"/>
+            <w:r>
+              <w:rPr>
+                <w:rFonts w:asciiTheme="minorHAnsi" w:eastAsia="Aptos Display" w:hAnsiTheme="minorHAnsi" w:cs="Aptos Display"/>
+                <w:color w:val="auto"/>
+                <w:sz w:val="18"/>
+                <w:szCs w:val="18"/>
+              </w:rPr>
+              <w:t xml:space="preserve"> fits into multiple domains, select the domain most directly addressed by its scenario and analysis. Refer to </w:t>
             </w:r>
             <w:hyperlink w:anchor="_Appendix_A:_Domain" w:history="1">
               <w:r>
@@ -691,7 +978,7 @@
         </w:tc>
         <w:tc>
           <w:tcPr>
-            <w:tcW w:w="3975" w:type="dxa"/>
+            <w:tcW w:w="3260" w:type="dxa"/>
             <w:shd w:val="clear" w:color="auto" w:fill="FFFFFF" w:themeFill="background1"/>
             <w:tcMar>
               <w:top w:w="90" w:type="dxa"/>
@@ -793,7 +1080,7 @@
         </w:tc>
         <w:tc>
           <w:tcPr>
-            <w:tcW w:w="3975" w:type="dxa"/>
+            <w:tcW w:w="3260" w:type="dxa"/>
             <w:shd w:val="clear" w:color="auto" w:fill="F7F9FB"/>
             <w:tcMar>
               <w:top w:w="90" w:type="dxa"/>
@@ -894,7 +1181,7 @@
         </w:tc>
         <w:tc>
           <w:tcPr>
-            <w:tcW w:w="3975" w:type="dxa"/>
+            <w:tcW w:w="3260" w:type="dxa"/>
             <w:shd w:val="clear" w:color="auto" w:fill="FFFFFF" w:themeFill="background1"/>
             <w:tcMar>
               <w:top w:w="90" w:type="dxa"/>
@@ -996,7 +1283,7 @@
         </w:tc>
         <w:tc>
           <w:tcPr>
-            <w:tcW w:w="3975" w:type="dxa"/>
+            <w:tcW w:w="3260" w:type="dxa"/>
             <w:shd w:val="clear" w:color="auto" w:fill="F7F9FB"/>
             <w:tcMar>
               <w:top w:w="90" w:type="dxa"/>
@@ -1305,13 +1592,33 @@
                 <w:sz w:val="18"/>
                 <w:szCs w:val="18"/>
               </w:rPr>
-              <w:t xml:space="preserve"> the usecase cannot be fixed or no longer suitable for publication;</w:t>
+              <w:t xml:space="preserve"> the </w:t>
+            </w:r>
+            <w:proofErr w:type="spellStart"/>
+            <w:r>
+              <w:rPr>
+                <w:rFonts w:asciiTheme="minorHAnsi" w:eastAsia="Aptos Display" w:hAnsiTheme="minorHAnsi" w:cs="Aptos Display"/>
+                <w:color w:val="auto"/>
+                <w:sz w:val="18"/>
+                <w:szCs w:val="18"/>
+              </w:rPr>
+              <w:t>usecase</w:t>
+            </w:r>
+            <w:proofErr w:type="spellEnd"/>
+            <w:r>
+              <w:rPr>
+                <w:rFonts w:asciiTheme="minorHAnsi" w:eastAsia="Aptos Display" w:hAnsiTheme="minorHAnsi" w:cs="Aptos Display"/>
+                <w:color w:val="auto"/>
+                <w:sz w:val="18"/>
+                <w:szCs w:val="18"/>
+              </w:rPr>
+              <w:t xml:space="preserve"> cannot be fixed or no longer suitable for publication;</w:t>
             </w:r>
           </w:p>
         </w:tc>
         <w:tc>
           <w:tcPr>
-            <w:tcW w:w="3975" w:type="dxa"/>
+            <w:tcW w:w="3260" w:type="dxa"/>
             <w:shd w:val="clear" w:color="auto" w:fill="FFFFFF" w:themeFill="background1"/>
             <w:tcMar>
               <w:top w:w="90" w:type="dxa"/>
@@ -1651,7 +1958,7 @@
         </w:tc>
         <w:tc>
           <w:tcPr>
-            <w:tcW w:w="3975" w:type="dxa"/>
+            <w:tcW w:w="3260" w:type="dxa"/>
             <w:shd w:val="clear" w:color="auto" w:fill="F7F9FB"/>
             <w:tcMar>
               <w:top w:w="90" w:type="dxa"/>
@@ -1746,7 +2053,27 @@
                 <w:sz w:val="18"/>
                 <w:szCs w:val="18"/>
               </w:rPr>
-              <w:t>Add the MS Planner Card hyperlink after creating it. Display only the usecase code as the linked text. R</w:t>
+              <w:t xml:space="preserve">Add the MS Planner Card hyperlink after creating it. Display only the </w:t>
+            </w:r>
+            <w:proofErr w:type="spellStart"/>
+            <w:r>
+              <w:rPr>
+                <w:rFonts w:asciiTheme="minorHAnsi" w:eastAsiaTheme="majorEastAsia" w:hAnsiTheme="minorHAnsi"/>
+                <w:color w:val="auto"/>
+                <w:sz w:val="18"/>
+                <w:szCs w:val="18"/>
+              </w:rPr>
+              <w:t>usecase</w:t>
+            </w:r>
+            <w:proofErr w:type="spellEnd"/>
+            <w:r>
+              <w:rPr>
+                <w:rFonts w:asciiTheme="minorHAnsi" w:eastAsiaTheme="majorEastAsia" w:hAnsiTheme="minorHAnsi"/>
+                <w:color w:val="auto"/>
+                <w:sz w:val="18"/>
+                <w:szCs w:val="18"/>
+              </w:rPr>
+              <w:t xml:space="preserve"> code as the linked text. R</w:t>
             </w:r>
             <w:r>
               <w:rPr>
@@ -1782,7 +2109,7 @@
         </w:tc>
         <w:tc>
           <w:tcPr>
-            <w:tcW w:w="3975" w:type="dxa"/>
+            <w:tcW w:w="3260" w:type="dxa"/>
             <w:shd w:val="clear" w:color="auto" w:fill="FFFFFF" w:themeFill="background1"/>
             <w:tcMar>
               <w:top w:w="90" w:type="dxa"/>
@@ -1848,7 +2175,27 @@
                 <w:sz w:val="18"/>
                 <w:szCs w:val="18"/>
               </w:rPr>
-              <w:t>Does the usecase file name match the title within the notebook and dependency folder?</w:t>
+              <w:t xml:space="preserve">Does the </w:t>
+            </w:r>
+            <w:proofErr w:type="spellStart"/>
+            <w:r>
+              <w:rPr>
+                <w:rFonts w:asciiTheme="minorHAnsi" w:eastAsiaTheme="majorEastAsia" w:hAnsiTheme="minorHAnsi"/>
+                <w:color w:val="auto"/>
+                <w:sz w:val="18"/>
+                <w:szCs w:val="18"/>
+              </w:rPr>
+              <w:t>usecase</w:t>
+            </w:r>
+            <w:proofErr w:type="spellEnd"/>
+            <w:r>
+              <w:rPr>
+                <w:rFonts w:asciiTheme="minorHAnsi" w:eastAsiaTheme="majorEastAsia" w:hAnsiTheme="minorHAnsi"/>
+                <w:color w:val="auto"/>
+                <w:sz w:val="18"/>
+                <w:szCs w:val="18"/>
+              </w:rPr>
+              <w:t xml:space="preserve"> file name match the title within the notebook and dependency folder?</w:t>
             </w:r>
           </w:p>
         </w:tc>
@@ -1880,7 +2227,27 @@
                 <w:sz w:val="18"/>
                 <w:szCs w:val="18"/>
               </w:rPr>
-              <w:t>Check that the same usecase name is used consistently in all relevant files and file names.</w:t>
+              <w:t xml:space="preserve">Check that the same </w:t>
+            </w:r>
+            <w:proofErr w:type="spellStart"/>
+            <w:r>
+              <w:rPr>
+                <w:rFonts w:asciiTheme="minorHAnsi" w:eastAsiaTheme="majorEastAsia" w:hAnsiTheme="minorHAnsi"/>
+                <w:color w:val="auto"/>
+                <w:sz w:val="18"/>
+                <w:szCs w:val="18"/>
+              </w:rPr>
+              <w:t>usecase</w:t>
+            </w:r>
+            <w:proofErr w:type="spellEnd"/>
+            <w:r>
+              <w:rPr>
+                <w:rFonts w:asciiTheme="minorHAnsi" w:eastAsiaTheme="majorEastAsia" w:hAnsiTheme="minorHAnsi"/>
+                <w:color w:val="auto"/>
+                <w:sz w:val="18"/>
+                <w:szCs w:val="18"/>
+              </w:rPr>
+              <w:t xml:space="preserve"> name is used consistently in all relevant files and file names.</w:t>
             </w:r>
           </w:p>
           <w:p>
@@ -1905,7 +2272,7 @@
         </w:tc>
         <w:tc>
           <w:tcPr>
-            <w:tcW w:w="3975" w:type="dxa"/>
+            <w:tcW w:w="3260" w:type="dxa"/>
             <w:shd w:val="clear" w:color="auto" w:fill="F7F9FB"/>
             <w:tcMar>
               <w:top w:w="90" w:type="dxa"/>
@@ -1971,7 +2338,29 @@
                 <w:sz w:val="18"/>
                 <w:szCs w:val="18"/>
               </w:rPr>
-              <w:t>”, but the usecase title within the notebook is “_City Living Comfort”.</w:t>
+              <w:t xml:space="preserve">”, but the </w:t>
+            </w:r>
+            <w:proofErr w:type="spellStart"/>
+            <w:r>
+              <w:rPr>
+                <w:rStyle w:val="HTMLCode"/>
+                <w:rFonts w:asciiTheme="minorHAnsi" w:eastAsiaTheme="majorEastAsia" w:hAnsiTheme="minorHAnsi"/>
+                <w:color w:val="auto"/>
+                <w:sz w:val="18"/>
+                <w:szCs w:val="18"/>
+              </w:rPr>
+              <w:t>usecase</w:t>
+            </w:r>
+            <w:proofErr w:type="spellEnd"/>
+            <w:r>
+              <w:rPr>
+                <w:rStyle w:val="HTMLCode"/>
+                <w:rFonts w:asciiTheme="minorHAnsi" w:eastAsiaTheme="majorEastAsia" w:hAnsiTheme="minorHAnsi"/>
+                <w:color w:val="auto"/>
+                <w:sz w:val="18"/>
+                <w:szCs w:val="18"/>
+              </w:rPr>
+              <w:t xml:space="preserve"> title within the notebook is “_City Living Comfort”.</w:t>
             </w:r>
           </w:p>
         </w:tc>
@@ -2008,7 +2397,27 @@
                 <w:sz w:val="18"/>
                 <w:szCs w:val="18"/>
               </w:rPr>
-              <w:t>Does the name adequately reflect what the usecase is about? And is there a year/date range?</w:t>
+              <w:t xml:space="preserve">Does the name adequately reflect what the </w:t>
+            </w:r>
+            <w:proofErr w:type="spellStart"/>
+            <w:r>
+              <w:rPr>
+                <w:rFonts w:asciiTheme="minorHAnsi" w:eastAsiaTheme="majorEastAsia" w:hAnsiTheme="minorHAnsi"/>
+                <w:color w:val="auto"/>
+                <w:sz w:val="18"/>
+                <w:szCs w:val="18"/>
+              </w:rPr>
+              <w:t>usecase</w:t>
+            </w:r>
+            <w:proofErr w:type="spellEnd"/>
+            <w:r>
+              <w:rPr>
+                <w:rFonts w:asciiTheme="minorHAnsi" w:eastAsiaTheme="majorEastAsia" w:hAnsiTheme="minorHAnsi"/>
+                <w:color w:val="auto"/>
+                <w:sz w:val="18"/>
+                <w:szCs w:val="18"/>
+              </w:rPr>
+              <w:t xml:space="preserve"> is about? And is there a year/date range?</w:t>
             </w:r>
           </w:p>
         </w:tc>
@@ -2040,7 +2449,27 @@
                 <w:sz w:val="18"/>
                 <w:szCs w:val="18"/>
               </w:rPr>
-              <w:t>The name should clearly describe the topic that the usecase covers and include a relevant date or year range where applicable. Each name should:</w:t>
+              <w:t xml:space="preserve">The name should clearly describe the topic that the </w:t>
+            </w:r>
+            <w:proofErr w:type="spellStart"/>
+            <w:r>
+              <w:rPr>
+                <w:rFonts w:asciiTheme="minorHAnsi" w:eastAsiaTheme="majorEastAsia" w:hAnsiTheme="minorHAnsi"/>
+                <w:color w:val="auto"/>
+                <w:sz w:val="18"/>
+                <w:szCs w:val="18"/>
+              </w:rPr>
+              <w:t>usecase</w:t>
+            </w:r>
+            <w:proofErr w:type="spellEnd"/>
+            <w:r>
+              <w:rPr>
+                <w:rFonts w:asciiTheme="minorHAnsi" w:eastAsiaTheme="majorEastAsia" w:hAnsiTheme="minorHAnsi"/>
+                <w:color w:val="auto"/>
+                <w:sz w:val="18"/>
+                <w:szCs w:val="18"/>
+              </w:rPr>
+              <w:t xml:space="preserve"> covers and include a relevant date or year range where applicable. Each name should:</w:t>
             </w:r>
             <w:r>
               <w:rPr>
@@ -2102,7 +2531,7 @@
         </w:tc>
         <w:tc>
           <w:tcPr>
-            <w:tcW w:w="3975" w:type="dxa"/>
+            <w:tcW w:w="3260" w:type="dxa"/>
             <w:shd w:val="clear" w:color="auto" w:fill="F7F9FB"/>
             <w:tcMar>
               <w:top w:w="90" w:type="dxa"/>
@@ -2150,7 +2579,29 @@
                 <w:sz w:val="18"/>
                 <w:szCs w:val="18"/>
               </w:rPr>
-              <w:t xml:space="preserve"> “City_Living_Comfort” is too broad, has no date range and does not make sense.</w:t>
+              <w:t xml:space="preserve"> “</w:t>
+            </w:r>
+            <w:proofErr w:type="spellStart"/>
+            <w:r>
+              <w:rPr>
+                <w:rStyle w:val="HTMLCode"/>
+                <w:rFonts w:asciiTheme="minorHAnsi" w:eastAsiaTheme="majorEastAsia" w:hAnsiTheme="minorHAnsi"/>
+                <w:color w:val="auto"/>
+                <w:sz w:val="18"/>
+                <w:szCs w:val="18"/>
+              </w:rPr>
+              <w:t>City_Living_Comfort</w:t>
+            </w:r>
+            <w:proofErr w:type="spellEnd"/>
+            <w:r>
+              <w:rPr>
+                <w:rStyle w:val="HTMLCode"/>
+                <w:rFonts w:asciiTheme="minorHAnsi" w:eastAsiaTheme="majorEastAsia" w:hAnsiTheme="minorHAnsi"/>
+                <w:color w:val="auto"/>
+                <w:sz w:val="18"/>
+                <w:szCs w:val="18"/>
+              </w:rPr>
+              <w:t>” is too broad, has no date range and does not make sense.</w:t>
             </w:r>
           </w:p>
           <w:p>
@@ -2255,7 +2706,27 @@
                 <w:sz w:val="18"/>
                 <w:szCs w:val="18"/>
               </w:rPr>
-              <w:t>- what this usecase will teach you</w:t>
+              <w:t xml:space="preserve">- what this </w:t>
+            </w:r>
+            <w:proofErr w:type="spellStart"/>
+            <w:r>
+              <w:rPr>
+                <w:rFonts w:asciiTheme="minorHAnsi" w:eastAsiaTheme="majorEastAsia" w:hAnsiTheme="minorHAnsi"/>
+                <w:color w:val="auto"/>
+                <w:sz w:val="18"/>
+                <w:szCs w:val="18"/>
+              </w:rPr>
+              <w:t>usecase</w:t>
+            </w:r>
+            <w:proofErr w:type="spellEnd"/>
+            <w:r>
+              <w:rPr>
+                <w:rFonts w:asciiTheme="minorHAnsi" w:eastAsiaTheme="majorEastAsia" w:hAnsiTheme="minorHAnsi"/>
+                <w:color w:val="auto"/>
+                <w:sz w:val="18"/>
+                <w:szCs w:val="18"/>
+              </w:rPr>
+              <w:t xml:space="preserve"> will teach you</w:t>
             </w:r>
             <w:r>
               <w:rPr>
@@ -2344,7 +2815,27 @@
                 <w:sz w:val="18"/>
                 <w:szCs w:val="18"/>
               </w:rPr>
-              <w:t>Verify that the notebook begins with the required usecase title and metadata, followed by the five required unnumbered sections in this exact order, a</w:t>
+              <w:t xml:space="preserve">Verify that the notebook begins with the required </w:t>
+            </w:r>
+            <w:proofErr w:type="spellStart"/>
+            <w:r>
+              <w:rPr>
+                <w:rFonts w:asciiTheme="minorHAnsi" w:eastAsia="Aptos Display" w:hAnsiTheme="minorHAnsi" w:cs="Aptos Display"/>
+                <w:color w:val="auto"/>
+                <w:sz w:val="18"/>
+                <w:szCs w:val="18"/>
+              </w:rPr>
+              <w:t>usecase</w:t>
+            </w:r>
+            <w:proofErr w:type="spellEnd"/>
+            <w:r>
+              <w:rPr>
+                <w:rFonts w:asciiTheme="minorHAnsi" w:eastAsia="Aptos Display" w:hAnsiTheme="minorHAnsi" w:cs="Aptos Display"/>
+                <w:color w:val="auto"/>
+                <w:sz w:val="18"/>
+                <w:szCs w:val="18"/>
+              </w:rPr>
+              <w:t xml:space="preserve"> title and metadata, followed by the five required unnumbered sections in this exact order, a</w:t>
             </w:r>
             <w:r>
               <w:rPr>
@@ -2376,7 +2867,29 @@
                   <w:sz w:val="18"/>
                   <w:szCs w:val="18"/>
                 </w:rPr>
-                <w:t>MOP usecase-TEMPLATE.</w:t>
+                <w:t xml:space="preserve">MOP </w:t>
+              </w:r>
+              <w:proofErr w:type="spellStart"/>
+              <w:r>
+                <w:rPr>
+                  <w:rStyle w:val="Hyperlink"/>
+                  <w:rFonts w:asciiTheme="minorHAnsi" w:eastAsiaTheme="majorEastAsia" w:hAnsiTheme="minorHAnsi"/>
+                  <w:color w:val="auto"/>
+                  <w:sz w:val="18"/>
+                  <w:szCs w:val="18"/>
+                </w:rPr>
+                <w:t>usecase</w:t>
+              </w:r>
+              <w:proofErr w:type="spellEnd"/>
+              <w:r>
+                <w:rPr>
+                  <w:rStyle w:val="Hyperlink"/>
+                  <w:rFonts w:asciiTheme="minorHAnsi" w:eastAsiaTheme="majorEastAsia" w:hAnsiTheme="minorHAnsi"/>
+                  <w:color w:val="auto"/>
+                  <w:sz w:val="18"/>
+                  <w:szCs w:val="18"/>
+                </w:rPr>
+                <w:t>-TEMPLATE.</w:t>
               </w:r>
             </w:hyperlink>
           </w:p>
@@ -2428,27 +2941,9 @@
                 <w:sz w:val="18"/>
                 <w:szCs w:val="18"/>
               </w:rPr>
-              <w:t>What this usecase will teach you</w:t>
-            </w:r>
-            <w:r>
-              <w:rPr>
-                <w:rFonts w:asciiTheme="minorHAnsi" w:eastAsia="Aptos Display" w:hAnsiTheme="minorHAnsi" w:cs="Aptos Display"/>
-                <w:color w:val="auto"/>
-                <w:sz w:val="18"/>
-                <w:szCs w:val="18"/>
-              </w:rPr>
-              <w:t xml:space="preserve"> must describe the learning outcomes and skills the reader will gain. </w:t>
-            </w:r>
-          </w:p>
-          <w:p>
-            <w:pPr>
-              <w:rPr>
-                <w:rFonts w:asciiTheme="minorHAnsi" w:hAnsiTheme="minorHAnsi"/>
-                <w:color w:val="auto"/>
-                <w:sz w:val="18"/>
-                <w:szCs w:val="18"/>
-              </w:rPr>
-            </w:pPr>
+              <w:t xml:space="preserve">What this </w:t>
+            </w:r>
+            <w:proofErr w:type="spellStart"/>
             <w:r>
               <w:rPr>
                 <w:rFonts w:asciiTheme="minorHAnsi" w:eastAsia="Aptos Display" w:hAnsiTheme="minorHAnsi" w:cs="Aptos Display"/>
@@ -2458,27 +2953,9 @@
                 <w:sz w:val="18"/>
                 <w:szCs w:val="18"/>
               </w:rPr>
-              <w:t>Background</w:t>
-            </w:r>
-            <w:r>
-              <w:rPr>
-                <w:rFonts w:asciiTheme="minorHAnsi" w:eastAsia="Aptos Display" w:hAnsiTheme="minorHAnsi" w:cs="Aptos Display"/>
-                <w:color w:val="auto"/>
-                <w:sz w:val="18"/>
-                <w:szCs w:val="18"/>
-              </w:rPr>
-              <w:t xml:space="preserve"> must provide concise context or rationale that helps a non-technical reader understand the problem and approach. </w:t>
-            </w:r>
-          </w:p>
-          <w:p>
-            <w:pPr>
-              <w:rPr>
-                <w:rFonts w:asciiTheme="minorHAnsi" w:hAnsiTheme="minorHAnsi"/>
-                <w:color w:val="auto"/>
-                <w:sz w:val="18"/>
-                <w:szCs w:val="18"/>
-              </w:rPr>
-            </w:pPr>
+              <w:t>usecase</w:t>
+            </w:r>
+            <w:proofErr w:type="spellEnd"/>
             <w:r>
               <w:rPr>
                 <w:rFonts w:asciiTheme="minorHAnsi" w:eastAsia="Aptos Display" w:hAnsiTheme="minorHAnsi" w:cs="Aptos Display"/>
@@ -2488,7 +2965,7 @@
                 <w:sz w:val="18"/>
                 <w:szCs w:val="18"/>
               </w:rPr>
-              <w:t>Data Sets</w:t>
+              <w:t xml:space="preserve"> will teach you</w:t>
             </w:r>
             <w:r>
               <w:rPr>
@@ -2497,7 +2974,7 @@
                 <w:sz w:val="18"/>
                 <w:szCs w:val="18"/>
               </w:rPr>
-              <w:t xml:space="preserve"> must list every dataset used, include a working source or dependency-folder link, and may include a brief description of each dataset.</w:t>
+              <w:t xml:space="preserve"> must describe the learning outcomes and skills the reader will gain. </w:t>
             </w:r>
           </w:p>
           <w:p>
@@ -2518,6 +2995,66 @@
                 <w:sz w:val="18"/>
                 <w:szCs w:val="18"/>
               </w:rPr>
+              <w:t>Background</w:t>
+            </w:r>
+            <w:r>
+              <w:rPr>
+                <w:rFonts w:asciiTheme="minorHAnsi" w:eastAsia="Aptos Display" w:hAnsiTheme="minorHAnsi" w:cs="Aptos Display"/>
+                <w:color w:val="auto"/>
+                <w:sz w:val="18"/>
+                <w:szCs w:val="18"/>
+              </w:rPr>
+              <w:t xml:space="preserve"> must provide concise context or rationale that helps a non-technical reader understand the problem and approach. </w:t>
+            </w:r>
+          </w:p>
+          <w:p>
+            <w:pPr>
+              <w:rPr>
+                <w:rFonts w:asciiTheme="minorHAnsi" w:hAnsiTheme="minorHAnsi"/>
+                <w:color w:val="auto"/>
+                <w:sz w:val="18"/>
+                <w:szCs w:val="18"/>
+              </w:rPr>
+            </w:pPr>
+            <w:r>
+              <w:rPr>
+                <w:rFonts w:asciiTheme="minorHAnsi" w:eastAsia="Aptos Display" w:hAnsiTheme="minorHAnsi" w:cs="Aptos Display"/>
+                <w:b/>
+                <w:bCs/>
+                <w:color w:val="auto"/>
+                <w:sz w:val="18"/>
+                <w:szCs w:val="18"/>
+              </w:rPr>
+              <w:t>Data Sets</w:t>
+            </w:r>
+            <w:r>
+              <w:rPr>
+                <w:rFonts w:asciiTheme="minorHAnsi" w:eastAsia="Aptos Display" w:hAnsiTheme="minorHAnsi" w:cs="Aptos Display"/>
+                <w:color w:val="auto"/>
+                <w:sz w:val="18"/>
+                <w:szCs w:val="18"/>
+              </w:rPr>
+              <w:t xml:space="preserve"> must list every dataset used, include a working source or dependency-folder link, and may include a brief description of each dataset.</w:t>
+            </w:r>
+          </w:p>
+          <w:p>
+            <w:pPr>
+              <w:rPr>
+                <w:rFonts w:asciiTheme="minorHAnsi" w:hAnsiTheme="minorHAnsi"/>
+                <w:color w:val="auto"/>
+                <w:sz w:val="18"/>
+                <w:szCs w:val="18"/>
+              </w:rPr>
+            </w:pPr>
+            <w:r>
+              <w:rPr>
+                <w:rFonts w:asciiTheme="minorHAnsi" w:eastAsia="Aptos Display" w:hAnsiTheme="minorHAnsi" w:cs="Aptos Display"/>
+                <w:b/>
+                <w:bCs/>
+                <w:color w:val="auto"/>
+                <w:sz w:val="18"/>
+                <w:szCs w:val="18"/>
+              </w:rPr>
               <w:t>Contents</w:t>
             </w:r>
             <w:r>
@@ -2533,7 +3070,7 @@
         </w:tc>
         <w:tc>
           <w:tcPr>
-            <w:tcW w:w="3975" w:type="dxa"/>
+            <w:tcW w:w="3260" w:type="dxa"/>
             <w:shd w:val="clear" w:color="auto" w:fill="FFFFFF" w:themeFill="background1"/>
             <w:tcMar>
               <w:top w:w="90" w:type="dxa"/>
@@ -2815,7 +3352,7 @@
         </w:tc>
         <w:tc>
           <w:tcPr>
-            <w:tcW w:w="3975" w:type="dxa"/>
+            <w:tcW w:w="3260" w:type="dxa"/>
             <w:shd w:val="clear" w:color="auto" w:fill="FFFFFF" w:themeFill="background1"/>
             <w:tcMar>
               <w:top w:w="90" w:type="dxa"/>
@@ -2970,7 +3507,27 @@
                 <w:sz w:val="18"/>
                 <w:szCs w:val="18"/>
               </w:rPr>
-              <w:t xml:space="preserve"> usecase should provide guided foundational steps.</w:t>
+              <w:t xml:space="preserve"> </w:t>
+            </w:r>
+            <w:proofErr w:type="spellStart"/>
+            <w:r>
+              <w:rPr>
+                <w:rFonts w:asciiTheme="minorHAnsi" w:eastAsia="Aptos Display" w:hAnsiTheme="minorHAnsi" w:cs="Aptos Display"/>
+                <w:color w:val="auto"/>
+                <w:sz w:val="18"/>
+                <w:szCs w:val="18"/>
+              </w:rPr>
+              <w:t>usecase</w:t>
+            </w:r>
+            <w:proofErr w:type="spellEnd"/>
+            <w:r>
+              <w:rPr>
+                <w:rFonts w:asciiTheme="minorHAnsi" w:eastAsia="Aptos Display" w:hAnsiTheme="minorHAnsi" w:cs="Aptos Display"/>
+                <w:color w:val="auto"/>
+                <w:sz w:val="18"/>
+                <w:szCs w:val="18"/>
+              </w:rPr>
+              <w:t xml:space="preserve"> should provide guided foundational steps.</w:t>
             </w:r>
           </w:p>
           <w:p>
@@ -3009,7 +3566,27 @@
                 <w:sz w:val="18"/>
                 <w:szCs w:val="18"/>
               </w:rPr>
-              <w:t xml:space="preserve"> usecase may assume basic Python and data-analysis knowledge.</w:t>
+              <w:t xml:space="preserve"> </w:t>
+            </w:r>
+            <w:proofErr w:type="spellStart"/>
+            <w:r>
+              <w:rPr>
+                <w:rFonts w:asciiTheme="minorHAnsi" w:eastAsia="Aptos Display" w:hAnsiTheme="minorHAnsi" w:cs="Aptos Display"/>
+                <w:color w:val="auto"/>
+                <w:sz w:val="18"/>
+                <w:szCs w:val="18"/>
+              </w:rPr>
+              <w:t>usecase</w:t>
+            </w:r>
+            <w:proofErr w:type="spellEnd"/>
+            <w:r>
+              <w:rPr>
+                <w:rFonts w:asciiTheme="minorHAnsi" w:eastAsia="Aptos Display" w:hAnsiTheme="minorHAnsi" w:cs="Aptos Display"/>
+                <w:color w:val="auto"/>
+                <w:sz w:val="18"/>
+                <w:szCs w:val="18"/>
+              </w:rPr>
+              <w:t xml:space="preserve"> may assume basic Python and data-analysis knowledge.</w:t>
             </w:r>
           </w:p>
           <w:p>
@@ -3041,6 +3618,7 @@
               </w:rPr>
               <w:t xml:space="preserve">Advanced </w:t>
             </w:r>
+            <w:proofErr w:type="spellStart"/>
             <w:r>
               <w:rPr>
                 <w:rFonts w:asciiTheme="minorHAnsi" w:eastAsia="Aptos Display" w:hAnsiTheme="minorHAnsi" w:cs="Aptos Display"/>
@@ -3048,7 +3626,17 @@
                 <w:sz w:val="18"/>
                 <w:szCs w:val="18"/>
               </w:rPr>
-              <w:t xml:space="preserve">usecase may use complex modelling, geospatial methods, or specialised techniques. </w:t>
+              <w:t>usecase</w:t>
+            </w:r>
+            <w:proofErr w:type="spellEnd"/>
+            <w:r>
+              <w:rPr>
+                <w:rFonts w:asciiTheme="minorHAnsi" w:eastAsia="Aptos Display" w:hAnsiTheme="minorHAnsi" w:cs="Aptos Display"/>
+                <w:color w:val="auto"/>
+                <w:sz w:val="18"/>
+                <w:szCs w:val="18"/>
+              </w:rPr>
+              <w:t xml:space="preserve"> may use complex modelling, geospatial methods, or specialised techniques. </w:t>
             </w:r>
           </w:p>
           <w:p>
@@ -3083,7 +3671,7 @@
         </w:tc>
         <w:tc>
           <w:tcPr>
-            <w:tcW w:w="3975" w:type="dxa"/>
+            <w:tcW w:w="3260" w:type="dxa"/>
             <w:shd w:val="clear" w:color="auto" w:fill="F7F9FB"/>
             <w:tcMar>
               <w:top w:w="90" w:type="dxa"/>
@@ -3221,7 +3809,27 @@
                 <w:sz w:val="18"/>
                 <w:szCs w:val="18"/>
               </w:rPr>
-              <w:t>Check that the notebook lists only the knowledge and tools readers need before starting the usecase. For example:</w:t>
+              <w:t xml:space="preserve">Check that the notebook lists only the knowledge and tools readers need before starting the </w:t>
+            </w:r>
+            <w:proofErr w:type="spellStart"/>
+            <w:r>
+              <w:rPr>
+                <w:rFonts w:asciiTheme="minorHAnsi" w:eastAsia="Aptos Display" w:hAnsiTheme="minorHAnsi" w:cs="Aptos Display"/>
+                <w:color w:val="auto"/>
+                <w:sz w:val="18"/>
+                <w:szCs w:val="18"/>
+              </w:rPr>
+              <w:t>usecase</w:t>
+            </w:r>
+            <w:proofErr w:type="spellEnd"/>
+            <w:r>
+              <w:rPr>
+                <w:rFonts w:asciiTheme="minorHAnsi" w:eastAsia="Aptos Display" w:hAnsiTheme="minorHAnsi" w:cs="Aptos Display"/>
+                <w:color w:val="auto"/>
+                <w:sz w:val="18"/>
+                <w:szCs w:val="18"/>
+              </w:rPr>
+              <w:t>. For example:</w:t>
             </w:r>
           </w:p>
           <w:p>
@@ -3430,7 +4038,27 @@
                 <w:sz w:val="18"/>
                 <w:szCs w:val="18"/>
               </w:rPr>
-              <w:t xml:space="preserve"> GeoPandas.</w:t>
+              <w:t xml:space="preserve"> </w:t>
+            </w:r>
+            <w:proofErr w:type="spellStart"/>
+            <w:r>
+              <w:rPr>
+                <w:rFonts w:asciiTheme="minorHAnsi" w:eastAsia="Aptos Display" w:hAnsiTheme="minorHAnsi" w:cs="Aptos Display"/>
+                <w:color w:val="auto"/>
+                <w:sz w:val="18"/>
+                <w:szCs w:val="18"/>
+              </w:rPr>
+              <w:t>GeoPandas</w:t>
+            </w:r>
+            <w:proofErr w:type="spellEnd"/>
+            <w:r>
+              <w:rPr>
+                <w:rFonts w:asciiTheme="minorHAnsi" w:eastAsia="Aptos Display" w:hAnsiTheme="minorHAnsi" w:cs="Aptos Display"/>
+                <w:color w:val="auto"/>
+                <w:sz w:val="18"/>
+                <w:szCs w:val="18"/>
+              </w:rPr>
+              <w:t>.</w:t>
             </w:r>
           </w:p>
           <w:p>
@@ -3464,7 +4092,7 @@
         </w:tc>
         <w:tc>
           <w:tcPr>
-            <w:tcW w:w="3975" w:type="dxa"/>
+            <w:tcW w:w="3260" w:type="dxa"/>
             <w:shd w:val="clear" w:color="auto" w:fill="FFFFFF" w:themeFill="background1"/>
             <w:tcMar>
               <w:top w:w="90" w:type="dxa"/>
@@ -3549,7 +4177,27 @@
                 <w:sz w:val="18"/>
                 <w:szCs w:val="18"/>
               </w:rPr>
-              <w:t>Does the "Scenario” clearly outline the purpose / goal of the usecase? If not, please specify.</w:t>
+              <w:t xml:space="preserve">Does the "Scenario” clearly outline the purpose / goal of the </w:t>
+            </w:r>
+            <w:proofErr w:type="spellStart"/>
+            <w:r>
+              <w:rPr>
+                <w:rFonts w:asciiTheme="minorHAnsi" w:eastAsiaTheme="majorEastAsia" w:hAnsiTheme="minorHAnsi"/>
+                <w:color w:val="auto"/>
+                <w:sz w:val="18"/>
+                <w:szCs w:val="18"/>
+              </w:rPr>
+              <w:t>usecase</w:t>
+            </w:r>
+            <w:proofErr w:type="spellEnd"/>
+            <w:r>
+              <w:rPr>
+                <w:rFonts w:asciiTheme="minorHAnsi" w:eastAsiaTheme="majorEastAsia" w:hAnsiTheme="minorHAnsi"/>
+                <w:color w:val="auto"/>
+                <w:sz w:val="18"/>
+                <w:szCs w:val="18"/>
+              </w:rPr>
+              <w:t>? If not, please specify.</w:t>
             </w:r>
           </w:p>
         </w:tc>
@@ -3627,7 +4275,7 @@
         </w:tc>
         <w:tc>
           <w:tcPr>
-            <w:tcW w:w="3975" w:type="dxa"/>
+            <w:tcW w:w="3260" w:type="dxa"/>
             <w:shd w:val="clear" w:color="auto" w:fill="F7F9FB"/>
             <w:tcMar>
               <w:top w:w="90" w:type="dxa"/>
@@ -3653,7 +4301,27 @@
                 <w:sz w:val="18"/>
                 <w:szCs w:val="18"/>
               </w:rPr>
-              <w:t xml:space="preserve">Yes. It clearly explains the problem that the usecase is attempting to solve </w:t>
+              <w:t xml:space="preserve">Yes. It clearly explains the problem that the </w:t>
+            </w:r>
+            <w:proofErr w:type="spellStart"/>
+            <w:r>
+              <w:rPr>
+                <w:rFonts w:asciiTheme="minorHAnsi" w:eastAsiaTheme="majorEastAsia" w:hAnsiTheme="minorHAnsi"/>
+                <w:color w:val="auto"/>
+                <w:sz w:val="18"/>
+                <w:szCs w:val="18"/>
+              </w:rPr>
+              <w:t>usecase</w:t>
+            </w:r>
+            <w:proofErr w:type="spellEnd"/>
+            <w:r>
+              <w:rPr>
+                <w:rFonts w:asciiTheme="minorHAnsi" w:eastAsiaTheme="majorEastAsia" w:hAnsiTheme="minorHAnsi"/>
+                <w:color w:val="auto"/>
+                <w:sz w:val="18"/>
+                <w:szCs w:val="18"/>
+              </w:rPr>
+              <w:t xml:space="preserve"> is attempting to solve </w:t>
             </w:r>
           </w:p>
         </w:tc>
@@ -3690,7 +4358,27 @@
                 <w:sz w:val="18"/>
                 <w:szCs w:val="18"/>
               </w:rPr>
-              <w:t>Is the target audience of the usecase defined in the scenario? If not, please specify.</w:t>
+              <w:t xml:space="preserve">Is the target audience of the </w:t>
+            </w:r>
+            <w:proofErr w:type="spellStart"/>
+            <w:r>
+              <w:rPr>
+                <w:rFonts w:asciiTheme="minorHAnsi" w:eastAsiaTheme="majorEastAsia" w:hAnsiTheme="minorHAnsi"/>
+                <w:color w:val="auto"/>
+                <w:sz w:val="18"/>
+                <w:szCs w:val="18"/>
+              </w:rPr>
+              <w:t>usecase</w:t>
+            </w:r>
+            <w:proofErr w:type="spellEnd"/>
+            <w:r>
+              <w:rPr>
+                <w:rFonts w:asciiTheme="minorHAnsi" w:eastAsiaTheme="majorEastAsia" w:hAnsiTheme="minorHAnsi"/>
+                <w:color w:val="auto"/>
+                <w:sz w:val="18"/>
+                <w:szCs w:val="18"/>
+              </w:rPr>
+              <w:t xml:space="preserve"> defined in the scenario? If not, please specify.</w:t>
             </w:r>
           </w:p>
         </w:tc>
@@ -3722,7 +4410,27 @@
                 <w:sz w:val="18"/>
                 <w:szCs w:val="18"/>
               </w:rPr>
-              <w:t>Check that the Scenario identifies the intended reader, user, or beneficiary of the analysis, such as local business owner, researcher, student, or community staff. The audience should be specific enough to show who will use the findings and why the usecase is useful to them.</w:t>
+              <w:t xml:space="preserve">Check that the Scenario identifies the intended reader, user, or beneficiary of the analysis, such as local business owner, researcher, student, or community staff. The audience should be specific enough to show who will use the findings and why the </w:t>
+            </w:r>
+            <w:proofErr w:type="spellStart"/>
+            <w:r>
+              <w:rPr>
+                <w:rFonts w:asciiTheme="minorHAnsi" w:eastAsia="Aptos Display" w:hAnsiTheme="minorHAnsi" w:cs="Aptos Display"/>
+                <w:color w:val="auto"/>
+                <w:sz w:val="18"/>
+                <w:szCs w:val="18"/>
+              </w:rPr>
+              <w:t>usecase</w:t>
+            </w:r>
+            <w:proofErr w:type="spellEnd"/>
+            <w:r>
+              <w:rPr>
+                <w:rFonts w:asciiTheme="minorHAnsi" w:eastAsia="Aptos Display" w:hAnsiTheme="minorHAnsi" w:cs="Aptos Display"/>
+                <w:color w:val="auto"/>
+                <w:sz w:val="18"/>
+                <w:szCs w:val="18"/>
+              </w:rPr>
+              <w:t xml:space="preserve"> is useful to them.</w:t>
             </w:r>
             <w:r>
               <w:rPr>
@@ -3737,7 +4445,7 @@
         </w:tc>
         <w:tc>
           <w:tcPr>
-            <w:tcW w:w="3975" w:type="dxa"/>
+            <w:tcW w:w="3260" w:type="dxa"/>
             <w:shd w:val="clear" w:color="auto" w:fill="FFFFFF" w:themeFill="background1"/>
             <w:tcMar>
               <w:top w:w="90" w:type="dxa"/>
@@ -3784,7 +4492,29 @@
                 <w:sz w:val="18"/>
                 <w:szCs w:val="18"/>
               </w:rPr>
-              <w:t xml:space="preserve"> It states the usecase is aimed at Urban Planners.</w:t>
+              <w:t xml:space="preserve"> It states the </w:t>
+            </w:r>
+            <w:proofErr w:type="spellStart"/>
+            <w:r>
+              <w:rPr>
+                <w:rStyle w:val="HTMLCode"/>
+                <w:rFonts w:asciiTheme="minorHAnsi" w:eastAsiaTheme="majorEastAsia" w:hAnsiTheme="minorHAnsi"/>
+                <w:color w:val="auto"/>
+                <w:sz w:val="18"/>
+                <w:szCs w:val="18"/>
+              </w:rPr>
+              <w:t>usecase</w:t>
+            </w:r>
+            <w:proofErr w:type="spellEnd"/>
+            <w:r>
+              <w:rPr>
+                <w:rStyle w:val="HTMLCode"/>
+                <w:rFonts w:asciiTheme="minorHAnsi" w:eastAsiaTheme="majorEastAsia" w:hAnsiTheme="minorHAnsi"/>
+                <w:color w:val="auto"/>
+                <w:sz w:val="18"/>
+                <w:szCs w:val="18"/>
+              </w:rPr>
+              <w:t xml:space="preserve"> is aimed at Urban Planners.</w:t>
             </w:r>
           </w:p>
         </w:tc>
@@ -3858,7 +4588,27 @@
                 <w:sz w:val="18"/>
                 <w:szCs w:val="18"/>
               </w:rPr>
-              <w:t>Verify that all datasets have the correct name,  are linked, and listed before the contents section.</w:t>
+              <w:t xml:space="preserve">Verify that all datasets have the correct </w:t>
+            </w:r>
+            <w:proofErr w:type="gramStart"/>
+            <w:r>
+              <w:rPr>
+                <w:rFonts w:asciiTheme="minorHAnsi" w:eastAsiaTheme="majorEastAsia" w:hAnsiTheme="minorHAnsi"/>
+                <w:color w:val="auto"/>
+                <w:sz w:val="18"/>
+                <w:szCs w:val="18"/>
+              </w:rPr>
+              <w:t>name,  are</w:t>
+            </w:r>
+            <w:proofErr w:type="gramEnd"/>
+            <w:r>
+              <w:rPr>
+                <w:rFonts w:asciiTheme="minorHAnsi" w:eastAsiaTheme="majorEastAsia" w:hAnsiTheme="minorHAnsi"/>
+                <w:color w:val="auto"/>
+                <w:sz w:val="18"/>
+                <w:szCs w:val="18"/>
+              </w:rPr>
+              <w:t xml:space="preserve"> linked, and listed before the contents section.</w:t>
             </w:r>
           </w:p>
           <w:p>
@@ -3912,7 +4662,7 @@
         </w:tc>
         <w:tc>
           <w:tcPr>
-            <w:tcW w:w="3975" w:type="dxa"/>
+            <w:tcW w:w="3260" w:type="dxa"/>
             <w:shd w:val="clear" w:color="auto" w:fill="F7F9FB"/>
             <w:tcMar>
               <w:top w:w="90" w:type="dxa"/>
@@ -3960,7 +4710,29 @@
                 <w:sz w:val="18"/>
                 <w:szCs w:val="18"/>
               </w:rPr>
-              <w:t xml:space="preserve"> the pedestrian-count dataset is used in the usecase but is not listed in the Data Sets section.</w:t>
+              <w:t xml:space="preserve"> the pedestrian-count dataset is used in the </w:t>
+            </w:r>
+            <w:proofErr w:type="spellStart"/>
+            <w:r>
+              <w:rPr>
+                <w:rStyle w:val="HTMLCode"/>
+                <w:rFonts w:asciiTheme="minorHAnsi" w:eastAsiaTheme="majorEastAsia" w:hAnsiTheme="minorHAnsi"/>
+                <w:color w:val="auto"/>
+                <w:sz w:val="18"/>
+                <w:szCs w:val="18"/>
+              </w:rPr>
+              <w:t>usecase</w:t>
+            </w:r>
+            <w:proofErr w:type="spellEnd"/>
+            <w:r>
+              <w:rPr>
+                <w:rStyle w:val="HTMLCode"/>
+                <w:rFonts w:asciiTheme="minorHAnsi" w:eastAsiaTheme="majorEastAsia" w:hAnsiTheme="minorHAnsi"/>
+                <w:color w:val="auto"/>
+                <w:sz w:val="18"/>
+                <w:szCs w:val="18"/>
+              </w:rPr>
+              <w:t xml:space="preserve"> but is not listed in the Data Sets section.</w:t>
             </w:r>
           </w:p>
           <w:p>
@@ -4186,7 +4958,7 @@
         </w:tc>
         <w:tc>
           <w:tcPr>
-            <w:tcW w:w="3975" w:type="dxa"/>
+            <w:tcW w:w="3260" w:type="dxa"/>
             <w:shd w:val="clear" w:color="auto" w:fill="FFFFFF" w:themeFill="background1"/>
             <w:tcMar>
               <w:top w:w="90" w:type="dxa"/>
@@ -4318,7 +5090,7 @@
         </w:tc>
         <w:tc>
           <w:tcPr>
-            <w:tcW w:w="3975" w:type="dxa"/>
+            <w:tcW w:w="3260" w:type="dxa"/>
             <w:shd w:val="clear" w:color="auto" w:fill="F7F9FB"/>
             <w:tcMar>
               <w:top w:w="90" w:type="dxa"/>
@@ -4462,13 +5234,166 @@
                 <w:sz w:val="18"/>
                 <w:szCs w:val="18"/>
               </w:rPr>
-              <w:t xml:space="preserve">Do not accept processes that download API data to local storage before reading it. Search the notebook for local file-reading functions, such as pd.read_csv (), pd.read_excel(), pd.read_json(), or open(), to check. </w:t>
+              <w:t xml:space="preserve">Do not accept processes that download API data to local storage before reading it. Search the notebook for local file-reading functions, such as </w:t>
+            </w:r>
+            <w:proofErr w:type="spellStart"/>
+            <w:proofErr w:type="gramStart"/>
+            <w:r>
+              <w:rPr>
+                <w:rFonts w:asciiTheme="minorHAnsi" w:eastAsia="Aptos Display" w:hAnsiTheme="minorHAnsi" w:cs="Aptos Display"/>
+                <w:color w:val="auto"/>
+                <w:sz w:val="18"/>
+                <w:szCs w:val="18"/>
+              </w:rPr>
+              <w:t>pd.read</w:t>
+            </w:r>
+            <w:proofErr w:type="gramEnd"/>
+            <w:r>
+              <w:rPr>
+                <w:rFonts w:asciiTheme="minorHAnsi" w:eastAsia="Aptos Display" w:hAnsiTheme="minorHAnsi" w:cs="Aptos Display"/>
+                <w:color w:val="auto"/>
+                <w:sz w:val="18"/>
+                <w:szCs w:val="18"/>
+              </w:rPr>
+              <w:t>_csv</w:t>
+            </w:r>
+            <w:proofErr w:type="spellEnd"/>
+            <w:r>
+              <w:rPr>
+                <w:rFonts w:asciiTheme="minorHAnsi" w:eastAsia="Aptos Display" w:hAnsiTheme="minorHAnsi" w:cs="Aptos Display"/>
+                <w:color w:val="auto"/>
+                <w:sz w:val="18"/>
+                <w:szCs w:val="18"/>
+              </w:rPr>
+              <w:t xml:space="preserve"> (), </w:t>
+            </w:r>
+            <w:proofErr w:type="spellStart"/>
+            <w:proofErr w:type="gramStart"/>
+            <w:r>
+              <w:rPr>
+                <w:rFonts w:asciiTheme="minorHAnsi" w:eastAsia="Aptos Display" w:hAnsiTheme="minorHAnsi" w:cs="Aptos Display"/>
+                <w:color w:val="auto"/>
+                <w:sz w:val="18"/>
+                <w:szCs w:val="18"/>
+              </w:rPr>
+              <w:t>pd.read</w:t>
+            </w:r>
+            <w:proofErr w:type="gramEnd"/>
+            <w:r>
+              <w:rPr>
+                <w:rFonts w:asciiTheme="minorHAnsi" w:eastAsia="Aptos Display" w:hAnsiTheme="minorHAnsi" w:cs="Aptos Display"/>
+                <w:color w:val="auto"/>
+                <w:sz w:val="18"/>
+                <w:szCs w:val="18"/>
+              </w:rPr>
+              <w:t>_</w:t>
+            </w:r>
+            <w:proofErr w:type="gramStart"/>
+            <w:r>
+              <w:rPr>
+                <w:rFonts w:asciiTheme="minorHAnsi" w:eastAsia="Aptos Display" w:hAnsiTheme="minorHAnsi" w:cs="Aptos Display"/>
+                <w:color w:val="auto"/>
+                <w:sz w:val="18"/>
+                <w:szCs w:val="18"/>
+              </w:rPr>
+              <w:t>excel</w:t>
+            </w:r>
+            <w:proofErr w:type="spellEnd"/>
+            <w:r>
+              <w:rPr>
+                <w:rFonts w:asciiTheme="minorHAnsi" w:eastAsia="Aptos Display" w:hAnsiTheme="minorHAnsi" w:cs="Aptos Display"/>
+                <w:color w:val="auto"/>
+                <w:sz w:val="18"/>
+                <w:szCs w:val="18"/>
+              </w:rPr>
+              <w:t>(</w:t>
+            </w:r>
+            <w:proofErr w:type="gramEnd"/>
+            <w:r>
+              <w:rPr>
+                <w:rFonts w:asciiTheme="minorHAnsi" w:eastAsia="Aptos Display" w:hAnsiTheme="minorHAnsi" w:cs="Aptos Display"/>
+                <w:color w:val="auto"/>
+                <w:sz w:val="18"/>
+                <w:szCs w:val="18"/>
+              </w:rPr>
+              <w:t xml:space="preserve">), </w:t>
+            </w:r>
+            <w:proofErr w:type="spellStart"/>
+            <w:proofErr w:type="gramStart"/>
+            <w:r>
+              <w:rPr>
+                <w:rFonts w:asciiTheme="minorHAnsi" w:eastAsia="Aptos Display" w:hAnsiTheme="minorHAnsi" w:cs="Aptos Display"/>
+                <w:color w:val="auto"/>
+                <w:sz w:val="18"/>
+                <w:szCs w:val="18"/>
+              </w:rPr>
+              <w:t>pd.read</w:t>
+            </w:r>
+            <w:proofErr w:type="gramEnd"/>
+            <w:r>
+              <w:rPr>
+                <w:rFonts w:asciiTheme="minorHAnsi" w:eastAsia="Aptos Display" w:hAnsiTheme="minorHAnsi" w:cs="Aptos Display"/>
+                <w:color w:val="auto"/>
+                <w:sz w:val="18"/>
+                <w:szCs w:val="18"/>
+              </w:rPr>
+              <w:t>_</w:t>
+            </w:r>
+            <w:proofErr w:type="gramStart"/>
+            <w:r>
+              <w:rPr>
+                <w:rFonts w:asciiTheme="minorHAnsi" w:eastAsia="Aptos Display" w:hAnsiTheme="minorHAnsi" w:cs="Aptos Display"/>
+                <w:color w:val="auto"/>
+                <w:sz w:val="18"/>
+                <w:szCs w:val="18"/>
+              </w:rPr>
+              <w:t>json</w:t>
+            </w:r>
+            <w:proofErr w:type="spellEnd"/>
+            <w:r>
+              <w:rPr>
+                <w:rFonts w:asciiTheme="minorHAnsi" w:eastAsia="Aptos Display" w:hAnsiTheme="minorHAnsi" w:cs="Aptos Display"/>
+                <w:color w:val="auto"/>
+                <w:sz w:val="18"/>
+                <w:szCs w:val="18"/>
+              </w:rPr>
+              <w:t>(</w:t>
+            </w:r>
+            <w:proofErr w:type="gramEnd"/>
+            <w:r>
+              <w:rPr>
+                <w:rFonts w:asciiTheme="minorHAnsi" w:eastAsia="Aptos Display" w:hAnsiTheme="minorHAnsi" w:cs="Aptos Display"/>
+                <w:color w:val="auto"/>
+                <w:sz w:val="18"/>
+                <w:szCs w:val="18"/>
+              </w:rPr>
+              <w:t xml:space="preserve">), or </w:t>
+            </w:r>
+            <w:proofErr w:type="gramStart"/>
+            <w:r>
+              <w:rPr>
+                <w:rFonts w:asciiTheme="minorHAnsi" w:eastAsia="Aptos Display" w:hAnsiTheme="minorHAnsi" w:cs="Aptos Display"/>
+                <w:color w:val="auto"/>
+                <w:sz w:val="18"/>
+                <w:szCs w:val="18"/>
+              </w:rPr>
+              <w:t>open(</w:t>
+            </w:r>
+            <w:proofErr w:type="gramEnd"/>
+            <w:r>
+              <w:rPr>
+                <w:rFonts w:asciiTheme="minorHAnsi" w:eastAsia="Aptos Display" w:hAnsiTheme="minorHAnsi" w:cs="Aptos Display"/>
+                <w:color w:val="auto"/>
+                <w:sz w:val="18"/>
+                <w:szCs w:val="18"/>
+              </w:rPr>
+              <w:t xml:space="preserve">), to check. </w:t>
             </w:r>
           </w:p>
         </w:tc>
         <w:tc>
           <w:tcPr>
-            <w:tcW w:w="3975" w:type="dxa"/>
+            <w:tcW w:w="3260" w:type="dxa"/>
             <w:shd w:val="clear" w:color="auto" w:fill="FFFFFF" w:themeFill="background1"/>
             <w:tcMar>
               <w:top w:w="90" w:type="dxa"/>
@@ -4559,7 +5484,27 @@
                 <w:sz w:val="18"/>
                 <w:szCs w:val="18"/>
               </w:rPr>
-              <w:t>If no API used. Is the dataset being called from a dependency folder with the same name as the usecase?</w:t>
+              <w:t xml:space="preserve">If no API used. Is the dataset being called from a dependency folder with the same name as the </w:t>
+            </w:r>
+            <w:proofErr w:type="spellStart"/>
+            <w:r>
+              <w:rPr>
+                <w:rFonts w:asciiTheme="minorHAnsi" w:eastAsiaTheme="majorEastAsia" w:hAnsiTheme="minorHAnsi"/>
+                <w:color w:val="auto"/>
+                <w:sz w:val="18"/>
+                <w:szCs w:val="18"/>
+              </w:rPr>
+              <w:t>usecase</w:t>
+            </w:r>
+            <w:proofErr w:type="spellEnd"/>
+            <w:r>
+              <w:rPr>
+                <w:rFonts w:asciiTheme="minorHAnsi" w:eastAsiaTheme="majorEastAsia" w:hAnsiTheme="minorHAnsi"/>
+                <w:color w:val="auto"/>
+                <w:sz w:val="18"/>
+                <w:szCs w:val="18"/>
+              </w:rPr>
+              <w:t>?</w:t>
             </w:r>
           </w:p>
         </w:tc>
@@ -4612,7 +5557,27 @@
                 <w:sz w:val="18"/>
                 <w:szCs w:val="18"/>
               </w:rPr>
-              <w:t xml:space="preserve">. Check that the dependency folder name matches the usecase Code and Name; verify that the notebook load files using a relative path, for example: </w:t>
+              <w:t xml:space="preserve">. Check that the dependency folder name matches the </w:t>
+            </w:r>
+            <w:proofErr w:type="spellStart"/>
+            <w:r>
+              <w:rPr>
+                <w:rFonts w:asciiTheme="minorHAnsi" w:eastAsia="Aptos Display" w:hAnsiTheme="minorHAnsi" w:cs="Aptos Display"/>
+                <w:color w:val="auto"/>
+                <w:sz w:val="18"/>
+                <w:szCs w:val="18"/>
+              </w:rPr>
+              <w:t>usecase</w:t>
+            </w:r>
+            <w:proofErr w:type="spellEnd"/>
+            <w:r>
+              <w:rPr>
+                <w:rFonts w:asciiTheme="minorHAnsi" w:eastAsia="Aptos Display" w:hAnsiTheme="minorHAnsi" w:cs="Aptos Display"/>
+                <w:color w:val="auto"/>
+                <w:sz w:val="18"/>
+                <w:szCs w:val="18"/>
+              </w:rPr>
+              <w:t xml:space="preserve"> Code and Name; verify that the notebook load files using a relative path, for example: </w:t>
             </w:r>
             <w:r>
               <w:rPr>
@@ -4687,7 +5652,7 @@
         </w:tc>
         <w:tc>
           <w:tcPr>
-            <w:tcW w:w="3975" w:type="dxa"/>
+            <w:tcW w:w="3260" w:type="dxa"/>
             <w:shd w:val="clear" w:color="auto" w:fill="F7F9FB"/>
             <w:tcMar>
               <w:top w:w="90" w:type="dxa"/>
@@ -4814,7 +5779,29 @@
                   <w:sz w:val="18"/>
                   <w:szCs w:val="18"/>
                 </w:rPr>
-                <w:t>MOP usecase-TEMPLATE</w:t>
+                <w:t xml:space="preserve">MOP </w:t>
+              </w:r>
+              <w:proofErr w:type="spellStart"/>
+              <w:r>
+                <w:rPr>
+                  <w:rStyle w:val="Hyperlink"/>
+                  <w:rFonts w:asciiTheme="minorHAnsi" w:eastAsiaTheme="majorEastAsia" w:hAnsiTheme="minorHAnsi"/>
+                  <w:color w:val="auto"/>
+                  <w:sz w:val="18"/>
+                  <w:szCs w:val="18"/>
+                </w:rPr>
+                <w:t>usecase</w:t>
+              </w:r>
+              <w:proofErr w:type="spellEnd"/>
+              <w:r>
+                <w:rPr>
+                  <w:rStyle w:val="Hyperlink"/>
+                  <w:rFonts w:asciiTheme="minorHAnsi" w:eastAsiaTheme="majorEastAsia" w:hAnsiTheme="minorHAnsi"/>
+                  <w:color w:val="auto"/>
+                  <w:sz w:val="18"/>
+                  <w:szCs w:val="18"/>
+                </w:rPr>
+                <w:t>-TEMPLATE</w:t>
               </w:r>
             </w:hyperlink>
             <w:r>
@@ -4830,7 +5817,7 @@
         </w:tc>
         <w:tc>
           <w:tcPr>
-            <w:tcW w:w="3975" w:type="dxa"/>
+            <w:tcW w:w="3260" w:type="dxa"/>
             <w:shd w:val="clear" w:color="auto" w:fill="FFFFFF" w:themeFill="background1"/>
             <w:tcMar>
               <w:top w:w="90" w:type="dxa"/>
@@ -4952,7 +5939,7 @@
         </w:tc>
         <w:tc>
           <w:tcPr>
-            <w:tcW w:w="3975" w:type="dxa"/>
+            <w:tcW w:w="3260" w:type="dxa"/>
             <w:shd w:val="clear" w:color="auto" w:fill="F7F9FB"/>
             <w:tcMar>
               <w:top w:w="90" w:type="dxa"/>
@@ -4999,7 +5986,29 @@
                 <w:sz w:val="18"/>
                 <w:szCs w:val="18"/>
               </w:rPr>
-              <w:t xml:space="preserve"> the map in “Data Exploration” section returns a KeyError and does not display. </w:t>
+              <w:t xml:space="preserve"> the map in “Data Exploration” section returns a </w:t>
+            </w:r>
+            <w:proofErr w:type="spellStart"/>
+            <w:r>
+              <w:rPr>
+                <w:rStyle w:val="HTMLCode"/>
+                <w:rFonts w:asciiTheme="minorHAnsi" w:eastAsiaTheme="majorEastAsia" w:hAnsiTheme="minorHAnsi"/>
+                <w:color w:val="auto"/>
+                <w:sz w:val="18"/>
+                <w:szCs w:val="18"/>
+              </w:rPr>
+              <w:t>KeyError</w:t>
+            </w:r>
+            <w:proofErr w:type="spellEnd"/>
+            <w:r>
+              <w:rPr>
+                <w:rStyle w:val="HTMLCode"/>
+                <w:rFonts w:asciiTheme="minorHAnsi" w:eastAsiaTheme="majorEastAsia" w:hAnsiTheme="minorHAnsi"/>
+                <w:color w:val="auto"/>
+                <w:sz w:val="18"/>
+                <w:szCs w:val="18"/>
+              </w:rPr>
+              <w:t xml:space="preserve"> and does not display. </w:t>
             </w:r>
           </w:p>
         </w:tc>
@@ -5239,7 +6248,47 @@
                 <w:sz w:val="18"/>
                 <w:szCs w:val="18"/>
               </w:rPr>
-              <w:t xml:space="preserve"> precision@k and recall@k.</w:t>
+              <w:t xml:space="preserve"> </w:t>
+            </w:r>
+            <w:proofErr w:type="spellStart"/>
+            <w:r>
+              <w:rPr>
+                <w:rFonts w:asciiTheme="minorHAnsi" w:eastAsia="Aptos Display" w:hAnsiTheme="minorHAnsi" w:cs="Aptos Display"/>
+                <w:color w:val="auto"/>
+                <w:sz w:val="18"/>
+                <w:szCs w:val="18"/>
+              </w:rPr>
+              <w:t>precision@k</w:t>
+            </w:r>
+            <w:proofErr w:type="spellEnd"/>
+            <w:r>
+              <w:rPr>
+                <w:rFonts w:asciiTheme="minorHAnsi" w:eastAsia="Aptos Display" w:hAnsiTheme="minorHAnsi" w:cs="Aptos Display"/>
+                <w:color w:val="auto"/>
+                <w:sz w:val="18"/>
+                <w:szCs w:val="18"/>
+              </w:rPr>
+              <w:t xml:space="preserve"> and </w:t>
+            </w:r>
+            <w:proofErr w:type="spellStart"/>
+            <w:r>
+              <w:rPr>
+                <w:rFonts w:asciiTheme="minorHAnsi" w:eastAsia="Aptos Display" w:hAnsiTheme="minorHAnsi" w:cs="Aptos Display"/>
+                <w:color w:val="auto"/>
+                <w:sz w:val="18"/>
+                <w:szCs w:val="18"/>
+              </w:rPr>
+              <w:t>recall@k</w:t>
+            </w:r>
+            <w:proofErr w:type="spellEnd"/>
+            <w:r>
+              <w:rPr>
+                <w:rFonts w:asciiTheme="minorHAnsi" w:eastAsia="Aptos Display" w:hAnsiTheme="minorHAnsi" w:cs="Aptos Display"/>
+                <w:color w:val="auto"/>
+                <w:sz w:val="18"/>
+                <w:szCs w:val="18"/>
+              </w:rPr>
+              <w:t>.</w:t>
             </w:r>
           </w:p>
           <w:p>
@@ -5255,7 +6304,7 @@
         </w:tc>
         <w:tc>
           <w:tcPr>
-            <w:tcW w:w="3975" w:type="dxa"/>
+            <w:tcW w:w="3260" w:type="dxa"/>
             <w:shd w:val="clear" w:color="auto" w:fill="FFFFFF" w:themeFill="background1"/>
             <w:tcMar>
               <w:top w:w="90" w:type="dxa"/>
@@ -5387,7 +6436,7 @@
         </w:tc>
         <w:tc>
           <w:tcPr>
-            <w:tcW w:w="3975" w:type="dxa"/>
+            <w:tcW w:w="3260" w:type="dxa"/>
             <w:shd w:val="clear" w:color="auto" w:fill="F7F9FB"/>
             <w:tcMar>
               <w:top w:w="90" w:type="dxa"/>
@@ -5509,7 +6558,7 @@
         </w:tc>
         <w:tc>
           <w:tcPr>
-            <w:tcW w:w="3975" w:type="dxa"/>
+            <w:tcW w:w="3260" w:type="dxa"/>
             <w:shd w:val="clear" w:color="auto" w:fill="FFFFFF" w:themeFill="background1"/>
             <w:tcMar>
               <w:top w:w="90" w:type="dxa"/>
@@ -5604,13 +6653,33 @@
                 <w:sz w:val="18"/>
                 <w:szCs w:val="18"/>
               </w:rPr>
-              <w:t xml:space="preserve">Run the notebook sequentially from top to bottom. Check for visible errors, critical warnings, undefined variables, missing files, failed API calls, empty responses, incomplete outputs, and out-of-order cell dependencies. Confirm that all charts, tables, and results render properly. If large maps or datasets cause local performance bottlenecks, it is recommended to run the code to test the notebook. This can be done in Google Colab or with GPU instead. </w:t>
+              <w:t xml:space="preserve">Run the notebook sequentially from top to bottom. Check for visible errors, critical warnings, undefined variables, missing files, failed API calls, empty responses, incomplete outputs, and out-of-order cell dependencies. Confirm that all charts, tables, and results render properly. If large maps or datasets cause local performance bottlenecks, it is recommended to run the code to test the notebook. This can be done in Google </w:t>
+            </w:r>
+            <w:proofErr w:type="spellStart"/>
+            <w:r>
+              <w:rPr>
+                <w:rFonts w:asciiTheme="minorHAnsi" w:eastAsia="Aptos Display" w:hAnsiTheme="minorHAnsi" w:cs="Aptos Display"/>
+                <w:color w:val="auto"/>
+                <w:sz w:val="18"/>
+                <w:szCs w:val="18"/>
+              </w:rPr>
+              <w:t>Colab</w:t>
+            </w:r>
+            <w:proofErr w:type="spellEnd"/>
+            <w:r>
+              <w:rPr>
+                <w:rFonts w:asciiTheme="minorHAnsi" w:eastAsia="Aptos Display" w:hAnsiTheme="minorHAnsi" w:cs="Aptos Display"/>
+                <w:color w:val="auto"/>
+                <w:sz w:val="18"/>
+                <w:szCs w:val="18"/>
+              </w:rPr>
+              <w:t xml:space="preserve"> or with GPU instead. </w:t>
             </w:r>
           </w:p>
         </w:tc>
         <w:tc>
           <w:tcPr>
-            <w:tcW w:w="3975" w:type="dxa"/>
+            <w:tcW w:w="3260" w:type="dxa"/>
             <w:shd w:val="clear" w:color="auto" w:fill="F7F9FB"/>
             <w:tcMar>
               <w:top w:w="90" w:type="dxa"/>
@@ -5654,7 +6723,38 @@
                 <w:sz w:val="18"/>
                 <w:szCs w:val="18"/>
               </w:rPr>
-              <w:t xml:space="preserve"> Replace print(f'Request failed…') with structured error handling.</w:t>
+              <w:t xml:space="preserve"> Replace </w:t>
+            </w:r>
+            <w:proofErr w:type="gramStart"/>
+            <w:r>
+              <w:rPr>
+                <w:rFonts w:asciiTheme="minorHAnsi" w:hAnsiTheme="minorHAnsi"/>
+                <w:color w:val="auto"/>
+                <w:sz w:val="18"/>
+                <w:szCs w:val="18"/>
+              </w:rPr>
+              <w:t>print(</w:t>
+            </w:r>
+            <w:proofErr w:type="spellStart"/>
+            <w:proofErr w:type="gramEnd"/>
+            <w:r>
+              <w:rPr>
+                <w:rFonts w:asciiTheme="minorHAnsi" w:hAnsiTheme="minorHAnsi"/>
+                <w:color w:val="auto"/>
+                <w:sz w:val="18"/>
+                <w:szCs w:val="18"/>
+              </w:rPr>
+              <w:t>f'Request</w:t>
+            </w:r>
+            <w:proofErr w:type="spellEnd"/>
+            <w:r>
+              <w:rPr>
+                <w:rFonts w:asciiTheme="minorHAnsi" w:hAnsiTheme="minorHAnsi"/>
+                <w:color w:val="auto"/>
+                <w:sz w:val="18"/>
+                <w:szCs w:val="18"/>
+              </w:rPr>
+              <w:t xml:space="preserve"> failed…') with structured error handling.</w:t>
             </w:r>
           </w:p>
         </w:tc>
@@ -5766,7 +6866,7 @@
         </w:tc>
         <w:tc>
           <w:tcPr>
-            <w:tcW w:w="3975" w:type="dxa"/>
+            <w:tcW w:w="3260" w:type="dxa"/>
             <w:shd w:val="clear" w:color="auto" w:fill="FFFFFF" w:themeFill="background1"/>
             <w:tcMar>
               <w:top w:w="90" w:type="dxa"/>
@@ -5843,14 +6943,25 @@
                 <w:szCs w:val="18"/>
               </w:rPr>
             </w:pPr>
-            <w:r>
-              <w:rPr>
-                <w:rFonts w:asciiTheme="minorHAnsi" w:eastAsiaTheme="majorEastAsia" w:hAnsiTheme="minorHAnsi"/>
-                <w:color w:val="auto"/>
-                <w:sz w:val="18"/>
-                <w:szCs w:val="18"/>
-              </w:rPr>
-              <w:t>Are all output cells clean, with no unnecessary or debug print statements? If not, please specify.</w:t>
+            <w:proofErr w:type="gramStart"/>
+            <w:r>
+              <w:rPr>
+                <w:rFonts w:asciiTheme="minorHAnsi" w:eastAsiaTheme="majorEastAsia" w:hAnsiTheme="minorHAnsi"/>
+                <w:color w:val="auto"/>
+                <w:sz w:val="18"/>
+                <w:szCs w:val="18"/>
+              </w:rPr>
+              <w:t>Are</w:t>
+            </w:r>
+            <w:proofErr w:type="gramEnd"/>
+            <w:r>
+              <w:rPr>
+                <w:rFonts w:asciiTheme="minorHAnsi" w:eastAsiaTheme="majorEastAsia" w:hAnsiTheme="minorHAnsi"/>
+                <w:color w:val="auto"/>
+                <w:sz w:val="18"/>
+                <w:szCs w:val="18"/>
+              </w:rPr>
+              <w:t xml:space="preserve"> all output cells clean, with no unnecessary or debug print statements? If not, please specify.</w:t>
             </w:r>
           </w:p>
         </w:tc>
@@ -5882,7 +6993,27 @@
                 <w:sz w:val="18"/>
                 <w:szCs w:val="18"/>
               </w:rPr>
-              <w:t>Remove unnecessary outputs, including raw dataset previews, exploratory tables, debug messages, and excessively long print() results. Keep only outputs that support the learning steps or findings.</w:t>
+              <w:t xml:space="preserve">Remove unnecessary outputs, including raw dataset previews, exploratory tables, debug messages, and excessively long </w:t>
+            </w:r>
+            <w:proofErr w:type="gramStart"/>
+            <w:r>
+              <w:rPr>
+                <w:rFonts w:asciiTheme="minorHAnsi" w:eastAsia="Aptos Display" w:hAnsiTheme="minorHAnsi" w:cs="Aptos Display"/>
+                <w:color w:val="auto"/>
+                <w:sz w:val="18"/>
+                <w:szCs w:val="18"/>
+              </w:rPr>
+              <w:t>print(</w:t>
+            </w:r>
+            <w:proofErr w:type="gramEnd"/>
+            <w:r>
+              <w:rPr>
+                <w:rFonts w:asciiTheme="minorHAnsi" w:eastAsia="Aptos Display" w:hAnsiTheme="minorHAnsi" w:cs="Aptos Display"/>
+                <w:color w:val="auto"/>
+                <w:sz w:val="18"/>
+                <w:szCs w:val="18"/>
+              </w:rPr>
+              <w:t>) results. Keep only outputs that support the learning steps or findings.</w:t>
             </w:r>
             <w:r>
               <w:rPr>
@@ -5897,7 +7028,7 @@
         </w:tc>
         <w:tc>
           <w:tcPr>
-            <w:tcW w:w="3975" w:type="dxa"/>
+            <w:tcW w:w="3260" w:type="dxa"/>
             <w:shd w:val="clear" w:color="auto" w:fill="F7F9FB"/>
             <w:tcMar>
               <w:top w:w="90" w:type="dxa"/>
@@ -5944,7 +7075,29 @@
                 <w:sz w:val="18"/>
                 <w:szCs w:val="18"/>
               </w:rPr>
-              <w:t xml:space="preserve"> remove the print(df) printout after data cleaning.</w:t>
+              <w:t xml:space="preserve"> remove the print(</w:t>
+            </w:r>
+            <w:proofErr w:type="spellStart"/>
+            <w:r>
+              <w:rPr>
+                <w:rStyle w:val="HTMLCode"/>
+                <w:rFonts w:asciiTheme="minorHAnsi" w:eastAsiaTheme="majorEastAsia" w:hAnsiTheme="minorHAnsi"/>
+                <w:color w:val="auto"/>
+                <w:sz w:val="18"/>
+                <w:szCs w:val="18"/>
+              </w:rPr>
+              <w:t>df</w:t>
+            </w:r>
+            <w:proofErr w:type="spellEnd"/>
+            <w:r>
+              <w:rPr>
+                <w:rStyle w:val="HTMLCode"/>
+                <w:rFonts w:asciiTheme="minorHAnsi" w:eastAsiaTheme="majorEastAsia" w:hAnsiTheme="minorHAnsi"/>
+                <w:color w:val="auto"/>
+                <w:sz w:val="18"/>
+                <w:szCs w:val="18"/>
+              </w:rPr>
+              <w:t>) printout after data cleaning.</w:t>
             </w:r>
           </w:p>
         </w:tc>
@@ -6019,7 +7172,7 @@
         </w:tc>
         <w:tc>
           <w:tcPr>
-            <w:tcW w:w="3975" w:type="dxa"/>
+            <w:tcW w:w="3260" w:type="dxa"/>
             <w:shd w:val="clear" w:color="auto" w:fill="FFFFFF" w:themeFill="background1"/>
             <w:tcMar>
               <w:top w:w="90" w:type="dxa"/>
@@ -6167,7 +7320,7 @@
         </w:tc>
         <w:tc>
           <w:tcPr>
-            <w:tcW w:w="3975" w:type="dxa"/>
+            <w:tcW w:w="3260" w:type="dxa"/>
             <w:shd w:val="clear" w:color="auto" w:fill="F7F9FB"/>
             <w:tcMar>
               <w:top w:w="90" w:type="dxa"/>
@@ -6270,7 +7423,27 @@
                 <w:sz w:val="18"/>
                 <w:szCs w:val="18"/>
               </w:rPr>
-              <w:t>Is the usecase formatted like a tutorial?</w:t>
+              <w:t xml:space="preserve">Is the </w:t>
+            </w:r>
+            <w:proofErr w:type="spellStart"/>
+            <w:r>
+              <w:rPr>
+                <w:rFonts w:asciiTheme="minorHAnsi" w:eastAsiaTheme="majorEastAsia" w:hAnsiTheme="minorHAnsi"/>
+                <w:color w:val="auto"/>
+                <w:sz w:val="18"/>
+                <w:szCs w:val="18"/>
+              </w:rPr>
+              <w:t>usecase</w:t>
+            </w:r>
+            <w:proofErr w:type="spellEnd"/>
+            <w:r>
+              <w:rPr>
+                <w:rFonts w:asciiTheme="minorHAnsi" w:eastAsiaTheme="majorEastAsia" w:hAnsiTheme="minorHAnsi"/>
+                <w:color w:val="auto"/>
+                <w:sz w:val="18"/>
+                <w:szCs w:val="18"/>
+              </w:rPr>
+              <w:t xml:space="preserve"> formatted like a tutorial?</w:t>
             </w:r>
           </w:p>
         </w:tc>
@@ -6317,7 +7490,7 @@
         </w:tc>
         <w:tc>
           <w:tcPr>
-            <w:tcW w:w="3975" w:type="dxa"/>
+            <w:tcW w:w="3260" w:type="dxa"/>
             <w:shd w:val="clear" w:color="auto" w:fill="FFFFFF" w:themeFill="background1"/>
             <w:tcMar>
               <w:top w:w="90" w:type="dxa"/>
@@ -6457,7 +7630,27 @@
                 <w:sz w:val="18"/>
                 <w:szCs w:val="18"/>
               </w:rPr>
-              <w:t xml:space="preserve">- Check that sections are logically ordered and not scattered throughout the usecase, e.g. Importing libraries. </w:t>
+              <w:t xml:space="preserve">- Check that sections are logically ordered and not scattered throughout the </w:t>
+            </w:r>
+            <w:proofErr w:type="spellStart"/>
+            <w:r>
+              <w:rPr>
+                <w:rFonts w:asciiTheme="minorHAnsi" w:eastAsia="Aptos Display" w:hAnsiTheme="minorHAnsi" w:cs="Aptos Display"/>
+                <w:color w:val="auto"/>
+                <w:sz w:val="18"/>
+                <w:szCs w:val="18"/>
+              </w:rPr>
+              <w:t>usecase</w:t>
+            </w:r>
+            <w:proofErr w:type="spellEnd"/>
+            <w:r>
+              <w:rPr>
+                <w:rFonts w:asciiTheme="minorHAnsi" w:eastAsia="Aptos Display" w:hAnsiTheme="minorHAnsi" w:cs="Aptos Display"/>
+                <w:color w:val="auto"/>
+                <w:sz w:val="18"/>
+                <w:szCs w:val="18"/>
+              </w:rPr>
+              <w:t xml:space="preserve">, e.g. Importing libraries. </w:t>
             </w:r>
           </w:p>
           <w:p>
@@ -6588,7 +7781,7 @@
         </w:tc>
         <w:tc>
           <w:tcPr>
-            <w:tcW w:w="3975" w:type="dxa"/>
+            <w:tcW w:w="3260" w:type="dxa"/>
             <w:shd w:val="clear" w:color="auto" w:fill="F7F9FB"/>
             <w:tcMar>
               <w:top w:w="90" w:type="dxa"/>
@@ -6633,7 +7826,27 @@
                 <w:sz w:val="18"/>
                 <w:szCs w:val="18"/>
               </w:rPr>
-              <w:t xml:space="preserve"> headings are clear, but “Importing Libraries” and “Data Loading” are separate short sections and should be combined. There are long print() outputs that should be shortened or replaced with a summary.</w:t>
+              <w:t xml:space="preserve"> headings are clear, but “Importing Libraries” and “Data Loading” are separate short sections and should be combined. There are long </w:t>
+            </w:r>
+            <w:proofErr w:type="gramStart"/>
+            <w:r>
+              <w:rPr>
+                <w:rFonts w:asciiTheme="minorHAnsi" w:eastAsia="Aptos Display" w:hAnsiTheme="minorHAnsi" w:cs="Aptos Display"/>
+                <w:color w:val="auto"/>
+                <w:sz w:val="18"/>
+                <w:szCs w:val="18"/>
+              </w:rPr>
+              <w:t>print(</w:t>
+            </w:r>
+            <w:proofErr w:type="gramEnd"/>
+            <w:r>
+              <w:rPr>
+                <w:rFonts w:asciiTheme="minorHAnsi" w:eastAsia="Aptos Display" w:hAnsiTheme="minorHAnsi" w:cs="Aptos Display"/>
+                <w:color w:val="auto"/>
+                <w:sz w:val="18"/>
+                <w:szCs w:val="18"/>
+              </w:rPr>
+              <w:t>) outputs that should be shortened or replaced with a summary.</w:t>
             </w:r>
           </w:p>
         </w:tc>
@@ -6713,7 +7926,29 @@
                   <w:sz w:val="18"/>
                   <w:szCs w:val="18"/>
                 </w:rPr>
-                <w:t>MOP usecase-TEMPLATE.</w:t>
+                <w:t xml:space="preserve">MOP </w:t>
+              </w:r>
+              <w:proofErr w:type="spellStart"/>
+              <w:r>
+                <w:rPr>
+                  <w:rStyle w:val="Hyperlink"/>
+                  <w:rFonts w:asciiTheme="minorHAnsi" w:eastAsiaTheme="majorEastAsia" w:hAnsiTheme="minorHAnsi"/>
+                  <w:color w:val="auto"/>
+                  <w:sz w:val="18"/>
+                  <w:szCs w:val="18"/>
+                </w:rPr>
+                <w:t>usecase</w:t>
+              </w:r>
+              <w:proofErr w:type="spellEnd"/>
+              <w:r>
+                <w:rPr>
+                  <w:rStyle w:val="Hyperlink"/>
+                  <w:rFonts w:asciiTheme="minorHAnsi" w:eastAsiaTheme="majorEastAsia" w:hAnsiTheme="minorHAnsi"/>
+                  <w:color w:val="auto"/>
+                  <w:sz w:val="18"/>
+                  <w:szCs w:val="18"/>
+                </w:rPr>
+                <w:t>-TEMPLATE.</w:t>
               </w:r>
               <w:r>
                 <w:rPr>
@@ -6757,7 +7992,7 @@
         </w:tc>
         <w:tc>
           <w:tcPr>
-            <w:tcW w:w="3975" w:type="dxa"/>
+            <w:tcW w:w="3260" w:type="dxa"/>
             <w:shd w:val="clear" w:color="auto" w:fill="FFFFFF" w:themeFill="background1"/>
             <w:tcMar>
               <w:top w:w="90" w:type="dxa"/>
@@ -6917,7 +8152,7 @@
         </w:tc>
         <w:tc>
           <w:tcPr>
-            <w:tcW w:w="3975" w:type="dxa"/>
+            <w:tcW w:w="3260" w:type="dxa"/>
             <w:shd w:val="clear" w:color="auto" w:fill="F7F9FB"/>
             <w:tcMar>
               <w:top w:w="90" w:type="dxa"/>
@@ -7011,7 +8246,27 @@
                 <w:sz w:val="18"/>
                 <w:szCs w:val="18"/>
               </w:rPr>
-              <w:t>Is the whole usecase in Australian English (no 'z's).</w:t>
+              <w:t xml:space="preserve">Is the whole </w:t>
+            </w:r>
+            <w:proofErr w:type="spellStart"/>
+            <w:r>
+              <w:rPr>
+                <w:rFonts w:asciiTheme="minorHAnsi" w:eastAsiaTheme="majorEastAsia" w:hAnsiTheme="minorHAnsi"/>
+                <w:color w:val="auto"/>
+                <w:sz w:val="18"/>
+                <w:szCs w:val="18"/>
+              </w:rPr>
+              <w:t>usecase</w:t>
+            </w:r>
+            <w:proofErr w:type="spellEnd"/>
+            <w:r>
+              <w:rPr>
+                <w:rFonts w:asciiTheme="minorHAnsi" w:eastAsiaTheme="majorEastAsia" w:hAnsiTheme="minorHAnsi"/>
+                <w:color w:val="auto"/>
+                <w:sz w:val="18"/>
+                <w:szCs w:val="18"/>
+              </w:rPr>
+              <w:t xml:space="preserve"> in Australian English (no 'z's).</w:t>
             </w:r>
           </w:p>
         </w:tc>
@@ -7068,7 +8323,7 @@
         </w:tc>
         <w:tc>
           <w:tcPr>
-            <w:tcW w:w="3975" w:type="dxa"/>
+            <w:tcW w:w="3260" w:type="dxa"/>
             <w:shd w:val="clear" w:color="auto" w:fill="FFFFFF" w:themeFill="background1"/>
             <w:tcMar>
               <w:top w:w="90" w:type="dxa"/>
@@ -7345,7 +8600,7 @@
         </w:tc>
         <w:tc>
           <w:tcPr>
-            <w:tcW w:w="3975" w:type="dxa"/>
+            <w:tcW w:w="3260" w:type="dxa"/>
             <w:shd w:val="clear" w:color="auto" w:fill="F7F9FB"/>
             <w:tcMar>
               <w:top w:w="90" w:type="dxa"/>
@@ -7493,7 +8748,7 @@
         </w:tc>
         <w:tc>
           <w:tcPr>
-            <w:tcW w:w="3975" w:type="dxa"/>
+            <w:tcW w:w="3260" w:type="dxa"/>
             <w:shd w:val="clear" w:color="auto" w:fill="FFFFFF" w:themeFill="background1"/>
             <w:tcMar>
               <w:top w:w="90" w:type="dxa"/>
@@ -7602,6 +8857,7 @@
         <w:t xml:space="preserve">Open </w:t>
       </w:r>
       <w:hyperlink r:id="rId16" w:history="1">
+        <w:proofErr w:type="spellStart"/>
         <w:r>
           <w:rPr>
             <w:rStyle w:val="Hyperlink"/>
@@ -7609,7 +8865,17 @@
             <w:sz w:val="18"/>
             <w:szCs w:val="18"/>
           </w:rPr>
-          <w:t>usecase Quality Tracker</w:t>
+          <w:t>usecase</w:t>
+        </w:r>
+        <w:proofErr w:type="spellEnd"/>
+        <w:r>
+          <w:rPr>
+            <w:rStyle w:val="Hyperlink"/>
+            <w:rFonts w:asciiTheme="majorHAnsi" w:eastAsiaTheme="majorEastAsia" w:hAnsiTheme="majorHAnsi"/>
+            <w:sz w:val="18"/>
+            <w:szCs w:val="18"/>
+          </w:rPr>
+          <w:t xml:space="preserve"> Quality Tracker</w:t>
         </w:r>
       </w:hyperlink>
       <w:r>
@@ -7641,7 +8907,43 @@
           <w:sz w:val="18"/>
           <w:szCs w:val="18"/>
         </w:rPr>
-        <w:t xml:space="preserve">Find a usecase that has not been reviewed yet, start from the top. The older usecases should be reviewed first. </w:t>
+        <w:t xml:space="preserve">Find a </w:t>
+      </w:r>
+      <w:proofErr w:type="spellStart"/>
+      <w:r>
+        <w:rPr>
+          <w:rFonts w:asciiTheme="majorHAnsi" w:eastAsiaTheme="majorEastAsia" w:hAnsiTheme="majorHAnsi"/>
+          <w:sz w:val="18"/>
+          <w:szCs w:val="18"/>
+        </w:rPr>
+        <w:t>usecase</w:t>
+      </w:r>
+      <w:proofErr w:type="spellEnd"/>
+      <w:r>
+        <w:rPr>
+          <w:rFonts w:asciiTheme="majorHAnsi" w:eastAsiaTheme="majorEastAsia" w:hAnsiTheme="majorHAnsi"/>
+          <w:sz w:val="18"/>
+          <w:szCs w:val="18"/>
+        </w:rPr>
+        <w:t xml:space="preserve"> that has not been reviewed yet, start from the top. The older </w:t>
+      </w:r>
+      <w:proofErr w:type="spellStart"/>
+      <w:r>
+        <w:rPr>
+          <w:rFonts w:asciiTheme="majorHAnsi" w:eastAsiaTheme="majorEastAsia" w:hAnsiTheme="majorHAnsi"/>
+          <w:sz w:val="18"/>
+          <w:szCs w:val="18"/>
+        </w:rPr>
+        <w:t>usecases</w:t>
+      </w:r>
+      <w:proofErr w:type="spellEnd"/>
+      <w:r>
+        <w:rPr>
+          <w:rFonts w:asciiTheme="majorHAnsi" w:eastAsiaTheme="majorEastAsia" w:hAnsiTheme="majorHAnsi"/>
+          <w:sz w:val="18"/>
+          <w:szCs w:val="18"/>
+        </w:rPr>
+        <w:t xml:space="preserve"> should be reviewed first. </w:t>
       </w:r>
     </w:p>
     <w:p>
@@ -7687,7 +8989,25 @@
           <w:sz w:val="18"/>
           <w:szCs w:val="18"/>
         </w:rPr>
-        <w:t>Set “Review Status (Dropdown)” to ‘Review in Progress’ so the tracker reflects the correct status of each usecase review.</w:t>
+        <w:t xml:space="preserve">Set “Review Status (Dropdown)” to ‘Review in Progress’ so the tracker reflects the correct status of each </w:t>
+      </w:r>
+      <w:proofErr w:type="spellStart"/>
+      <w:r>
+        <w:rPr>
+          <w:rFonts w:asciiTheme="majorHAnsi" w:eastAsiaTheme="majorEastAsia" w:hAnsiTheme="majorHAnsi"/>
+          <w:sz w:val="18"/>
+          <w:szCs w:val="18"/>
+        </w:rPr>
+        <w:t>usecase</w:t>
+      </w:r>
+      <w:proofErr w:type="spellEnd"/>
+      <w:r>
+        <w:rPr>
+          <w:rFonts w:asciiTheme="majorHAnsi" w:eastAsiaTheme="majorEastAsia" w:hAnsiTheme="majorHAnsi"/>
+          <w:sz w:val="18"/>
+          <w:szCs w:val="18"/>
+        </w:rPr>
+        <w:t xml:space="preserve"> review.</w:t>
       </w:r>
     </w:p>
     <w:p>
@@ -7724,7 +9044,57 @@
           <w:sz w:val="18"/>
           <w:szCs w:val="18"/>
         </w:rPr>
-        <w:t xml:space="preserve">Locate the usecases .ipynb file in the </w:t>
+        <w:t xml:space="preserve">Locate the </w:t>
+      </w:r>
+      <w:proofErr w:type="spellStart"/>
+      <w:proofErr w:type="gramStart"/>
+      <w:r>
+        <w:rPr>
+          <w:rFonts w:asciiTheme="majorHAnsi" w:eastAsiaTheme="majorEastAsia" w:hAnsiTheme="majorHAnsi"/>
+          <w:b/>
+          <w:bCs/>
+          <w:color w:val="4C94D8" w:themeColor="text2" w:themeTint="80"/>
+          <w:sz w:val="18"/>
+          <w:szCs w:val="18"/>
+        </w:rPr>
+        <w:t>usecases</w:t>
+      </w:r>
+      <w:proofErr w:type="spellEnd"/>
+      <w:r>
+        <w:rPr>
+          <w:rFonts w:asciiTheme="majorHAnsi" w:eastAsiaTheme="majorEastAsia" w:hAnsiTheme="majorHAnsi"/>
+          <w:b/>
+          <w:bCs/>
+          <w:color w:val="4C94D8" w:themeColor="text2" w:themeTint="80"/>
+          <w:sz w:val="18"/>
+          <w:szCs w:val="18"/>
+        </w:rPr>
+        <w:t xml:space="preserve"> .</w:t>
+      </w:r>
+      <w:proofErr w:type="spellStart"/>
+      <w:r>
+        <w:rPr>
+          <w:rFonts w:asciiTheme="majorHAnsi" w:eastAsiaTheme="majorEastAsia" w:hAnsiTheme="majorHAnsi"/>
+          <w:b/>
+          <w:bCs/>
+          <w:color w:val="4C94D8" w:themeColor="text2" w:themeTint="80"/>
+          <w:sz w:val="18"/>
+          <w:szCs w:val="18"/>
+        </w:rPr>
+        <w:t>ipynb</w:t>
+      </w:r>
+      <w:proofErr w:type="spellEnd"/>
+      <w:proofErr w:type="gramEnd"/>
+      <w:r>
+        <w:rPr>
+          <w:rFonts w:asciiTheme="majorHAnsi" w:eastAsiaTheme="majorEastAsia" w:hAnsiTheme="majorHAnsi"/>
+          <w:b/>
+          <w:bCs/>
+          <w:color w:val="4C94D8" w:themeColor="text2" w:themeTint="80"/>
+          <w:sz w:val="18"/>
+          <w:szCs w:val="18"/>
+        </w:rPr>
+        <w:t xml:space="preserve"> file in the </w:t>
       </w:r>
       <w:hyperlink r:id="rId17">
         <w:r>
@@ -7737,8 +9107,22 @@
             <w:sz w:val="18"/>
             <w:szCs w:val="18"/>
           </w:rPr>
-          <w:t>GitHub repository-usecases</w:t>
+          <w:t>GitHub repository-</w:t>
         </w:r>
+        <w:proofErr w:type="spellStart"/>
+        <w:r>
+          <w:rPr>
+            <w:rStyle w:val="Hyperlink"/>
+            <w:rFonts w:asciiTheme="majorHAnsi" w:eastAsiaTheme="majorEastAsia" w:hAnsiTheme="majorHAnsi"/>
+            <w:b/>
+            <w:bCs/>
+            <w:color w:val="4C94D8" w:themeColor="text2" w:themeTint="80"/>
+            <w:sz w:val="18"/>
+            <w:szCs w:val="18"/>
+          </w:rPr>
+          <w:t>usecases</w:t>
+        </w:r>
+        <w:proofErr w:type="spellEnd"/>
       </w:hyperlink>
       <w:r>
         <w:rPr>
@@ -7772,7 +9156,53 @@
           <w:sz w:val="18"/>
           <w:szCs w:val="18"/>
         </w:rPr>
-        <w:t>Locate the notebook .ipynb file according to the usecase code, for example, UC00010, using the ‘Go to file’ search box in the top right. Notebooks may be under status folders such as READY TO PUBLISH or UPDATE NEEDED and, in a Domain/Year/Trimester path.</w:t>
+        <w:t xml:space="preserve">Locate the </w:t>
+      </w:r>
+      <w:proofErr w:type="gramStart"/>
+      <w:r>
+        <w:rPr>
+          <w:rFonts w:asciiTheme="majorHAnsi" w:eastAsiaTheme="majorEastAsia" w:hAnsiTheme="majorHAnsi"/>
+          <w:sz w:val="18"/>
+          <w:szCs w:val="18"/>
+        </w:rPr>
+        <w:t>notebook .</w:t>
+      </w:r>
+      <w:proofErr w:type="spellStart"/>
+      <w:r>
+        <w:rPr>
+          <w:rFonts w:asciiTheme="majorHAnsi" w:eastAsiaTheme="majorEastAsia" w:hAnsiTheme="majorHAnsi"/>
+          <w:sz w:val="18"/>
+          <w:szCs w:val="18"/>
+        </w:rPr>
+        <w:t>ipynb</w:t>
+      </w:r>
+      <w:proofErr w:type="spellEnd"/>
+      <w:proofErr w:type="gramEnd"/>
+      <w:r>
+        <w:rPr>
+          <w:rFonts w:asciiTheme="majorHAnsi" w:eastAsiaTheme="majorEastAsia" w:hAnsiTheme="majorHAnsi"/>
+          <w:sz w:val="18"/>
+          <w:szCs w:val="18"/>
+        </w:rPr>
+        <w:t xml:space="preserve"> file according to the </w:t>
+      </w:r>
+      <w:proofErr w:type="spellStart"/>
+      <w:r>
+        <w:rPr>
+          <w:rFonts w:asciiTheme="majorHAnsi" w:eastAsiaTheme="majorEastAsia" w:hAnsiTheme="majorHAnsi"/>
+          <w:sz w:val="18"/>
+          <w:szCs w:val="18"/>
+        </w:rPr>
+        <w:t>usecase</w:t>
+      </w:r>
+      <w:proofErr w:type="spellEnd"/>
+      <w:r>
+        <w:rPr>
+          <w:rFonts w:asciiTheme="majorHAnsi" w:eastAsiaTheme="majorEastAsia" w:hAnsiTheme="majorHAnsi"/>
+          <w:sz w:val="18"/>
+          <w:szCs w:val="18"/>
+        </w:rPr>
+        <w:t xml:space="preserve"> code, for example, UC00010, using the ‘Go to file’ search box in the top right. Notebooks may be under status folders such as READY TO PUBLISH or UPDATE NEEDED and, in a Domain/Year/Trimester path.</w:t>
       </w:r>
     </w:p>
     <w:p>
@@ -7853,6 +9283,7 @@
         <w:t xml:space="preserve">Review the notebook against every column in the </w:t>
       </w:r>
       <w:hyperlink r:id="rId18">
+        <w:proofErr w:type="spellStart"/>
         <w:r>
           <w:rPr>
             <w:rStyle w:val="Hyperlink"/>
@@ -7860,7 +9291,17 @@
             <w:sz w:val="18"/>
             <w:szCs w:val="18"/>
           </w:rPr>
-          <w:t>usecase Quality Tracker</w:t>
+          <w:t>usecase</w:t>
+        </w:r>
+        <w:proofErr w:type="spellEnd"/>
+        <w:r>
+          <w:rPr>
+            <w:rStyle w:val="Hyperlink"/>
+            <w:rFonts w:asciiTheme="majorHAnsi" w:eastAsiaTheme="majorEastAsia" w:hAnsiTheme="majorHAnsi"/>
+            <w:sz w:val="18"/>
+            <w:szCs w:val="18"/>
+          </w:rPr>
+          <w:t xml:space="preserve"> Quality Tracker</w:t>
         </w:r>
       </w:hyperlink>
       <w:r>
@@ -8046,7 +9487,25 @@
           <w:sz w:val="18"/>
           <w:szCs w:val="18"/>
         </w:rPr>
-        <w:t>Put the card into the ‘Backlog’ bucket. Use the usecase code as the card title (for example, ‘UC00010’) and apply the required ‘Data Science’ and ‘Update Needed’ labels.</w:t>
+        <w:t xml:space="preserve">Put the card into the ‘Backlog’ bucket. Use the </w:t>
+      </w:r>
+      <w:proofErr w:type="spellStart"/>
+      <w:r>
+        <w:rPr>
+          <w:rFonts w:asciiTheme="majorHAnsi" w:eastAsiaTheme="majorEastAsia" w:hAnsiTheme="majorHAnsi"/>
+          <w:sz w:val="18"/>
+          <w:szCs w:val="18"/>
+        </w:rPr>
+        <w:t>usecase</w:t>
+      </w:r>
+      <w:proofErr w:type="spellEnd"/>
+      <w:r>
+        <w:rPr>
+          <w:rFonts w:asciiTheme="majorHAnsi" w:eastAsiaTheme="majorEastAsia" w:hAnsiTheme="majorHAnsi"/>
+          <w:sz w:val="18"/>
+          <w:szCs w:val="18"/>
+        </w:rPr>
+        <w:t xml:space="preserve"> code as the card title (for example, ‘UC00010’) and apply the required ‘Data Science’ and ‘Update Needed’ labels.</w:t>
       </w:r>
     </w:p>
     <w:p>
@@ -8069,7 +9528,25 @@
           <w:sz w:val="18"/>
           <w:szCs w:val="18"/>
         </w:rPr>
-        <w:t xml:space="preserve">Include the GitHub link for the usecase as an attachment to the Planner card </w:t>
+        <w:t xml:space="preserve">Include the GitHub link for the </w:t>
+      </w:r>
+      <w:proofErr w:type="spellStart"/>
+      <w:r>
+        <w:rPr>
+          <w:rFonts w:asciiTheme="majorHAnsi" w:eastAsiaTheme="majorEastAsia" w:hAnsiTheme="majorHAnsi"/>
+          <w:sz w:val="18"/>
+          <w:szCs w:val="18"/>
+        </w:rPr>
+        <w:t>usecase</w:t>
+      </w:r>
+      <w:proofErr w:type="spellEnd"/>
+      <w:r>
+        <w:rPr>
+          <w:rFonts w:asciiTheme="majorHAnsi" w:eastAsiaTheme="majorEastAsia" w:hAnsiTheme="majorHAnsi"/>
+          <w:sz w:val="18"/>
+          <w:szCs w:val="18"/>
+        </w:rPr>
+        <w:t xml:space="preserve"> as an attachment to the Planner card </w:t>
       </w:r>
     </w:p>
     <w:p>
@@ -8532,7 +10009,35 @@
                 <w:sz w:val="18"/>
                 <w:szCs w:val="18"/>
               </w:rPr>
-              <w:t>5. Once complete push new .ipynb file to FINALISED folder in GitHub and set quality manager and mentor as reviewers.</w:t>
+              <w:t xml:space="preserve">5. Once complete push </w:t>
+            </w:r>
+            <w:proofErr w:type="gramStart"/>
+            <w:r>
+              <w:rPr>
+                <w:rFonts w:asciiTheme="majorHAnsi" w:eastAsiaTheme="majorEastAsia" w:hAnsiTheme="majorHAnsi"/>
+                <w:sz w:val="18"/>
+                <w:szCs w:val="18"/>
+              </w:rPr>
+              <w:t>new .</w:t>
+            </w:r>
+            <w:proofErr w:type="spellStart"/>
+            <w:r>
+              <w:rPr>
+                <w:rFonts w:asciiTheme="majorHAnsi" w:eastAsiaTheme="majorEastAsia" w:hAnsiTheme="majorHAnsi"/>
+                <w:sz w:val="18"/>
+                <w:szCs w:val="18"/>
+              </w:rPr>
+              <w:t>ipynb</w:t>
+            </w:r>
+            <w:proofErr w:type="spellEnd"/>
+            <w:proofErr w:type="gramEnd"/>
+            <w:r>
+              <w:rPr>
+                <w:rFonts w:asciiTheme="majorHAnsi" w:eastAsiaTheme="majorEastAsia" w:hAnsiTheme="majorHAnsi"/>
+                <w:sz w:val="18"/>
+                <w:szCs w:val="18"/>
+              </w:rPr>
+              <w:t xml:space="preserve"> file to FINALISED folder in GitHub and set quality manager and mentor as reviewers.</w:t>
             </w:r>
           </w:p>
           <w:p>
@@ -8550,7 +10055,25 @@
                 <w:sz w:val="18"/>
                 <w:szCs w:val="18"/>
               </w:rPr>
-              <w:t>6. Delete old files associated with this usecase.</w:t>
+              <w:t xml:space="preserve">6. Delete old files associated with this </w:t>
+            </w:r>
+            <w:proofErr w:type="spellStart"/>
+            <w:r>
+              <w:rPr>
+                <w:rFonts w:asciiTheme="majorHAnsi" w:eastAsiaTheme="majorEastAsia" w:hAnsiTheme="majorHAnsi"/>
+                <w:sz w:val="18"/>
+                <w:szCs w:val="18"/>
+              </w:rPr>
+              <w:t>usecase</w:t>
+            </w:r>
+            <w:proofErr w:type="spellEnd"/>
+            <w:r>
+              <w:rPr>
+                <w:rFonts w:asciiTheme="majorHAnsi" w:eastAsiaTheme="majorEastAsia" w:hAnsiTheme="majorHAnsi"/>
+                <w:sz w:val="18"/>
+                <w:szCs w:val="18"/>
+              </w:rPr>
+              <w:t>.</w:t>
             </w:r>
           </w:p>
           <w:p>
@@ -8571,6 +10094,7 @@
               <w:t xml:space="preserve">7. Update the </w:t>
             </w:r>
             <w:hyperlink r:id="rId21">
+              <w:proofErr w:type="spellStart"/>
               <w:r>
                 <w:rPr>
                   <w:rStyle w:val="Hyperlink"/>
@@ -8580,6 +10104,7 @@
                 </w:rPr>
                 <w:t>usecase_Index</w:t>
               </w:r>
+              <w:proofErr w:type="spellEnd"/>
             </w:hyperlink>
             <w:r>
               <w:rPr>
@@ -8740,7 +10265,45 @@
                 <w:sz w:val="18"/>
                 <w:szCs w:val="18"/>
               </w:rPr>
-              <w:t>2. Fix bug: Add na=False to str.contains('DIS').</w:t>
+              <w:t xml:space="preserve">2. Fix bug: Add </w:t>
+            </w:r>
+            <w:proofErr w:type="spellStart"/>
+            <w:r>
+              <w:rPr>
+                <w:rFonts w:asciiTheme="majorHAnsi" w:eastAsiaTheme="majorEastAsia" w:hAnsiTheme="majorHAnsi"/>
+                <w:sz w:val="18"/>
+                <w:szCs w:val="18"/>
+              </w:rPr>
+              <w:t>na</w:t>
+            </w:r>
+            <w:proofErr w:type="spellEnd"/>
+            <w:r>
+              <w:rPr>
+                <w:rFonts w:asciiTheme="majorHAnsi" w:eastAsiaTheme="majorEastAsia" w:hAnsiTheme="majorHAnsi"/>
+                <w:sz w:val="18"/>
+                <w:szCs w:val="18"/>
+              </w:rPr>
+              <w:t xml:space="preserve">=False to </w:t>
+            </w:r>
+            <w:proofErr w:type="spellStart"/>
+            <w:proofErr w:type="gramStart"/>
+            <w:r>
+              <w:rPr>
+                <w:rFonts w:asciiTheme="majorHAnsi" w:eastAsiaTheme="majorEastAsia" w:hAnsiTheme="majorHAnsi"/>
+                <w:sz w:val="18"/>
+                <w:szCs w:val="18"/>
+              </w:rPr>
+              <w:t>str.contains</w:t>
+            </w:r>
+            <w:proofErr w:type="spellEnd"/>
+            <w:proofErr w:type="gramEnd"/>
+            <w:r>
+              <w:rPr>
+                <w:rFonts w:asciiTheme="majorHAnsi" w:eastAsiaTheme="majorEastAsia" w:hAnsiTheme="majorHAnsi"/>
+                <w:sz w:val="18"/>
+                <w:szCs w:val="18"/>
+              </w:rPr>
+              <w:t>('DIS').</w:t>
             </w:r>
             <w:r>
               <w:rPr>
@@ -8782,11 +10345,19 @@
         <w:t xml:space="preserve">Step 5 — Link Planner card in </w:t>
       </w:r>
       <w:hyperlink r:id="rId22">
+        <w:proofErr w:type="spellStart"/>
         <w:r>
           <w:rPr>
             <w:rStyle w:val="Hyperlink"/>
           </w:rPr>
-          <w:t>usecase Quality Tracker</w:t>
+          <w:t>usecase</w:t>
+        </w:r>
+        <w:proofErr w:type="spellEnd"/>
+        <w:r>
+          <w:rPr>
+            <w:rStyle w:val="Hyperlink"/>
+          </w:rPr>
+          <w:t xml:space="preserve"> Quality Tracker</w:t>
         </w:r>
       </w:hyperlink>
     </w:p>
@@ -8810,7 +10381,25 @@
           <w:sz w:val="18"/>
           <w:szCs w:val="18"/>
         </w:rPr>
-        <w:t>Copy the link of the Planner card to the “Planner Card (URL)” column as a hyperlink and display the usecase code as the link text.</w:t>
+        <w:t xml:space="preserve">Copy the link of the Planner card to the “Planner Card (URL)” column as a hyperlink and display the </w:t>
+      </w:r>
+      <w:proofErr w:type="spellStart"/>
+      <w:r>
+        <w:rPr>
+          <w:rFonts w:asciiTheme="majorHAnsi" w:eastAsiaTheme="majorEastAsia" w:hAnsiTheme="majorHAnsi"/>
+          <w:sz w:val="18"/>
+          <w:szCs w:val="18"/>
+        </w:rPr>
+        <w:t>usecase</w:t>
+      </w:r>
+      <w:proofErr w:type="spellEnd"/>
+      <w:r>
+        <w:rPr>
+          <w:rFonts w:asciiTheme="majorHAnsi" w:eastAsiaTheme="majorEastAsia" w:hAnsiTheme="majorHAnsi"/>
+          <w:sz w:val="18"/>
+          <w:szCs w:val="18"/>
+        </w:rPr>
+        <w:t xml:space="preserve"> code as the link text.</w:t>
       </w:r>
     </w:p>
     <w:p>
@@ -8981,7 +10570,31 @@
           <w:sz w:val="16"/>
           <w:szCs w:val="16"/>
         </w:rPr>
-        <w:t>Figure 1: Copying the Planner card link (left) and pasting it into the ‘Planner Card (URL)’ column in the Usecase Quality Tracker (right).</w:t>
+        <w:t xml:space="preserve">Figure 1: Copying the Planner card link (left) and pasting it into the ‘Planner Card (URL)’ column in the </w:t>
+      </w:r>
+      <w:proofErr w:type="spellStart"/>
+      <w:r>
+        <w:rPr>
+          <w:rFonts w:asciiTheme="majorHAnsi" w:eastAsiaTheme="majorEastAsia" w:hAnsiTheme="majorHAnsi"/>
+          <w:i/>
+          <w:iCs/>
+          <w:color w:val="5B6470"/>
+          <w:sz w:val="16"/>
+          <w:szCs w:val="16"/>
+        </w:rPr>
+        <w:t>Usecase</w:t>
+      </w:r>
+      <w:proofErr w:type="spellEnd"/>
+      <w:r>
+        <w:rPr>
+          <w:rFonts w:asciiTheme="majorHAnsi" w:eastAsiaTheme="majorEastAsia" w:hAnsiTheme="majorHAnsi"/>
+          <w:i/>
+          <w:iCs/>
+          <w:color w:val="5B6470"/>
+          <w:sz w:val="16"/>
+          <w:szCs w:val="16"/>
+        </w:rPr>
+        <w:t xml:space="preserve"> Quality Tracker (right).</w:t>
       </w:r>
     </w:p>
     <w:p>
@@ -9007,11 +10620,19 @@
         <w:t xml:space="preserve">Step 6 — Update the ‘Date Reviewed’, ‘Review Status' and ‘Overall Rating’ in  </w:t>
       </w:r>
       <w:hyperlink r:id="rId25">
+        <w:proofErr w:type="spellStart"/>
         <w:r>
           <w:rPr>
             <w:rStyle w:val="Hyperlink"/>
           </w:rPr>
-          <w:t>usecase Quality Tracker</w:t>
+          <w:t>usecase</w:t>
+        </w:r>
+        <w:proofErr w:type="spellEnd"/>
+        <w:r>
+          <w:rPr>
+            <w:rStyle w:val="Hyperlink"/>
+          </w:rPr>
+          <w:t xml:space="preserve"> Quality Tracker</w:t>
         </w:r>
       </w:hyperlink>
     </w:p>
@@ -9080,7 +10701,25 @@
           <w:sz w:val="18"/>
           <w:szCs w:val="18"/>
         </w:rPr>
-        <w:t>Once the initial quality review is complete and updates are required, the Data Scientist follows the process below to update the usecase, create a pull request (PR), and complete the re-review through to final approval.</w:t>
+        <w:t xml:space="preserve">Once the initial quality review is complete and updates are required, the Data Scientist follows the process below to update the </w:t>
+      </w:r>
+      <w:proofErr w:type="spellStart"/>
+      <w:r>
+        <w:rPr>
+          <w:rFonts w:ascii="Aptos Display" w:eastAsia="Aptos Display" w:hAnsi="Aptos Display" w:cs="Aptos Display"/>
+          <w:sz w:val="18"/>
+          <w:szCs w:val="18"/>
+        </w:rPr>
+        <w:t>usecase</w:t>
+      </w:r>
+      <w:proofErr w:type="spellEnd"/>
+      <w:r>
+        <w:rPr>
+          <w:rFonts w:ascii="Aptos Display" w:eastAsia="Aptos Display" w:hAnsi="Aptos Display" w:cs="Aptos Display"/>
+          <w:sz w:val="18"/>
+          <w:szCs w:val="18"/>
+        </w:rPr>
+        <w:t>, create a pull request (PR), and complete the re-review through to final approval.</w:t>
       </w:r>
     </w:p>
     <w:p>
@@ -9280,7 +10919,21 @@
         <w:rPr>
           <w:rFonts w:eastAsia="Calibri"/>
         </w:rPr>
-        <w:t>Step 2 — Update the usecase and check the template</w:t>
+        <w:t xml:space="preserve">Step 2 — Update the </w:t>
+      </w:r>
+      <w:proofErr w:type="spellStart"/>
+      <w:r>
+        <w:rPr>
+          <w:rFonts w:eastAsia="Calibri"/>
+        </w:rPr>
+        <w:t>usecase</w:t>
+      </w:r>
+      <w:proofErr w:type="spellEnd"/>
+      <w:r>
+        <w:rPr>
+          <w:rFonts w:eastAsia="Calibri"/>
+        </w:rPr>
+        <w:t xml:space="preserve"> and check the template</w:t>
       </w:r>
     </w:p>
     <w:p>
@@ -9304,7 +10957,79 @@
           <w:sz w:val="18"/>
           <w:szCs w:val="18"/>
         </w:rPr>
-        <w:t>Update the usecase using the MOP usecase-TEMPLATE and ensure the usecase code/number is included in the usecase name and relevant file names.</w:t>
+        <w:t xml:space="preserve">Update the </w:t>
+      </w:r>
+      <w:proofErr w:type="spellStart"/>
+      <w:r>
+        <w:rPr>
+          <w:rFonts w:ascii="Aptos Display" w:eastAsia="Aptos Display" w:hAnsi="Aptos Display" w:cs="Aptos Display"/>
+          <w:sz w:val="18"/>
+          <w:szCs w:val="18"/>
+        </w:rPr>
+        <w:t>usecase</w:t>
+      </w:r>
+      <w:proofErr w:type="spellEnd"/>
+      <w:r>
+        <w:rPr>
+          <w:rFonts w:ascii="Aptos Display" w:eastAsia="Aptos Display" w:hAnsi="Aptos Display" w:cs="Aptos Display"/>
+          <w:sz w:val="18"/>
+          <w:szCs w:val="18"/>
+        </w:rPr>
+        <w:t xml:space="preserve"> using the MOP </w:t>
+      </w:r>
+      <w:proofErr w:type="spellStart"/>
+      <w:r>
+        <w:rPr>
+          <w:rFonts w:ascii="Aptos Display" w:eastAsia="Aptos Display" w:hAnsi="Aptos Display" w:cs="Aptos Display"/>
+          <w:sz w:val="18"/>
+          <w:szCs w:val="18"/>
+        </w:rPr>
+        <w:t>usecase</w:t>
+      </w:r>
+      <w:proofErr w:type="spellEnd"/>
+      <w:r>
+        <w:rPr>
+          <w:rFonts w:ascii="Aptos Display" w:eastAsia="Aptos Display" w:hAnsi="Aptos Display" w:cs="Aptos Display"/>
+          <w:sz w:val="18"/>
+          <w:szCs w:val="18"/>
+        </w:rPr>
+        <w:t xml:space="preserve">-TEMPLATE and ensure the </w:t>
+      </w:r>
+      <w:proofErr w:type="spellStart"/>
+      <w:r>
+        <w:rPr>
+          <w:rFonts w:ascii="Aptos Display" w:eastAsia="Aptos Display" w:hAnsi="Aptos Display" w:cs="Aptos Display"/>
+          <w:sz w:val="18"/>
+          <w:szCs w:val="18"/>
+        </w:rPr>
+        <w:t>usecase</w:t>
+      </w:r>
+      <w:proofErr w:type="spellEnd"/>
+      <w:r>
+        <w:rPr>
+          <w:rFonts w:ascii="Aptos Display" w:eastAsia="Aptos Display" w:hAnsi="Aptos Display" w:cs="Aptos Display"/>
+          <w:sz w:val="18"/>
+          <w:szCs w:val="18"/>
+        </w:rPr>
+        <w:t xml:space="preserve"> code/number is included in the </w:t>
+      </w:r>
+      <w:proofErr w:type="spellStart"/>
+      <w:r>
+        <w:rPr>
+          <w:rFonts w:ascii="Aptos Display" w:eastAsia="Aptos Display" w:hAnsi="Aptos Display" w:cs="Aptos Display"/>
+          <w:sz w:val="18"/>
+          <w:szCs w:val="18"/>
+        </w:rPr>
+        <w:t>usecase</w:t>
+      </w:r>
+      <w:proofErr w:type="spellEnd"/>
+      <w:r>
+        <w:rPr>
+          <w:rFonts w:ascii="Aptos Display" w:eastAsia="Aptos Display" w:hAnsi="Aptos Display" w:cs="Aptos Display"/>
+          <w:sz w:val="18"/>
+          <w:szCs w:val="18"/>
+        </w:rPr>
+        <w:t xml:space="preserve"> name and relevant file names.</w:t>
       </w:r>
     </w:p>
     <w:p>
@@ -9488,7 +11213,25 @@
           <w:sz w:val="18"/>
           <w:szCs w:val="18"/>
         </w:rPr>
-        <w:t>Check that the usecase code/name, file structure, template requirements, layout, dependencies, and data sources are correct.</w:t>
+        <w:t xml:space="preserve">Check that the </w:t>
+      </w:r>
+      <w:proofErr w:type="spellStart"/>
+      <w:r>
+        <w:rPr>
+          <w:rFonts w:ascii="Aptos Display" w:eastAsia="Aptos Display" w:hAnsi="Aptos Display" w:cs="Aptos Display"/>
+          <w:sz w:val="18"/>
+          <w:szCs w:val="18"/>
+        </w:rPr>
+        <w:t>usecase</w:t>
+      </w:r>
+      <w:proofErr w:type="spellEnd"/>
+      <w:r>
+        <w:rPr>
+          <w:rFonts w:ascii="Aptos Display" w:eastAsia="Aptos Display" w:hAnsi="Aptos Display" w:cs="Aptos Display"/>
+          <w:sz w:val="18"/>
+          <w:szCs w:val="18"/>
+        </w:rPr>
+        <w:t xml:space="preserve"> code/name, file structure, template requirements, layout, dependencies, and data sources are correct.</w:t>
       </w:r>
     </w:p>
     <w:p>
@@ -9536,16 +11279,26 @@
           <w:sz w:val="18"/>
           <w:szCs w:val="18"/>
         </w:rPr>
-        <w:t>Remove or archive superseded files</w:t>
-      </w:r>
+        <w:t xml:space="preserve">Remove or archive superseded </w:t>
+      </w:r>
+      <w:proofErr w:type="gramStart"/>
       <w:r>
         <w:rPr>
           <w:rFonts w:ascii="Aptos Display" w:eastAsia="Aptos Display" w:hAnsi="Aptos Display" w:cs="Aptos Display"/>
           <w:sz w:val="18"/>
           <w:szCs w:val="18"/>
         </w:rPr>
+        <w:t>files</w:t>
+      </w:r>
+      <w:r>
+        <w:rPr>
+          <w:rFonts w:ascii="Aptos Display" w:eastAsia="Aptos Display" w:hAnsi="Aptos Display" w:cs="Aptos Display"/>
+          <w:sz w:val="18"/>
+          <w:szCs w:val="18"/>
+        </w:rPr>
         <w:t>(</w:t>
       </w:r>
+      <w:proofErr w:type="gramEnd"/>
       <w:r>
         <w:rPr>
           <w:rFonts w:ascii="Aptos Display" w:eastAsia="Aptos Display" w:hAnsi="Aptos Display" w:cs="Aptos Display"/>
@@ -9570,7 +11323,25 @@
           <w:sz w:val="18"/>
           <w:szCs w:val="18"/>
         </w:rPr>
-        <w:t xml:space="preserve"> where required and update the usecase_Index as required.</w:t>
+        <w:t xml:space="preserve"> where required and update the </w:t>
+      </w:r>
+      <w:proofErr w:type="spellStart"/>
+      <w:r>
+        <w:rPr>
+          <w:rFonts w:ascii="Aptos Display" w:eastAsia="Aptos Display" w:hAnsi="Aptos Display" w:cs="Aptos Display"/>
+          <w:sz w:val="18"/>
+          <w:szCs w:val="18"/>
+        </w:rPr>
+        <w:t>usecase_Index</w:t>
+      </w:r>
+      <w:proofErr w:type="spellEnd"/>
+      <w:r>
+        <w:rPr>
+          <w:rFonts w:ascii="Aptos Display" w:eastAsia="Aptos Display" w:hAnsi="Aptos Display" w:cs="Aptos Display"/>
+          <w:sz w:val="18"/>
+          <w:szCs w:val="18"/>
+        </w:rPr>
+        <w:t xml:space="preserve"> as required.</w:t>
       </w:r>
     </w:p>
     <w:p>
@@ -9632,8 +11403,9 @@
           <w:sz w:val="24"/>
           <w:szCs w:val="24"/>
         </w:rPr>
-        <w:t>DS: Usecase Update</w:t>
-      </w:r>
+        <w:t xml:space="preserve">DS: </w:t>
+      </w:r>
+      <w:proofErr w:type="spellStart"/>
       <w:r>
         <w:rPr>
           <w:rFonts w:eastAsia="Calibri"/>
@@ -9641,8 +11413,9 @@
           <w:sz w:val="24"/>
           <w:szCs w:val="24"/>
         </w:rPr>
-        <w:t>:</w:t>
-      </w:r>
+        <w:t>Usecase</w:t>
+      </w:r>
+      <w:proofErr w:type="spellEnd"/>
       <w:r>
         <w:rPr>
           <w:rFonts w:eastAsia="Calibri"/>
@@ -9650,8 +11423,37 @@
           <w:sz w:val="24"/>
           <w:szCs w:val="24"/>
         </w:rPr>
-        <w:t xml:space="preserve"> UCxxxxx</w:t>
-      </w:r>
+        <w:t xml:space="preserve"> Update</w:t>
+      </w:r>
+      <w:r>
+        <w:rPr>
+          <w:rFonts w:eastAsia="Calibri"/>
+          <w:color w:val="1F4D78"/>
+          <w:sz w:val="24"/>
+          <w:szCs w:val="24"/>
+        </w:rPr>
+        <w:t>:</w:t>
+      </w:r>
+      <w:r>
+        <w:rPr>
+          <w:rFonts w:eastAsia="Calibri"/>
+          <w:color w:val="1F4D78"/>
+          <w:sz w:val="24"/>
+          <w:szCs w:val="24"/>
+        </w:rPr>
+        <w:t xml:space="preserve"> </w:t>
+      </w:r>
+      <w:proofErr w:type="spellStart"/>
+      <w:r>
+        <w:rPr>
+          <w:rFonts w:eastAsia="Calibri"/>
+          <w:color w:val="1F4D78"/>
+          <w:sz w:val="24"/>
+          <w:szCs w:val="24"/>
+        </w:rPr>
+        <w:t>UCxxxxx</w:t>
+      </w:r>
+      <w:proofErr w:type="spellEnd"/>
       <w:r>
         <w:rPr>
           <w:rFonts w:eastAsia="Calibri"/>
@@ -9714,7 +11516,53 @@
           <w:sz w:val="18"/>
           <w:szCs w:val="18"/>
         </w:rPr>
-        <w:t>ush the updated .ipynb file and any required dependencies to a newly created feature branch in the GitHub repository, and create a PR from that branch. Each branch should contain only one use case, and all updates for that use case should be pushed to the same branch and PR for easier tracking and management.</w:t>
+        <w:t xml:space="preserve">ush the </w:t>
+      </w:r>
+      <w:proofErr w:type="gramStart"/>
+      <w:r>
+        <w:rPr>
+          <w:rFonts w:ascii="Aptos Display" w:eastAsia="Aptos Display" w:hAnsi="Aptos Display" w:cs="Aptos Display"/>
+          <w:sz w:val="18"/>
+          <w:szCs w:val="18"/>
+        </w:rPr>
+        <w:t>updated .</w:t>
+      </w:r>
+      <w:proofErr w:type="spellStart"/>
+      <w:r>
+        <w:rPr>
+          <w:rFonts w:ascii="Aptos Display" w:eastAsia="Aptos Display" w:hAnsi="Aptos Display" w:cs="Aptos Display"/>
+          <w:sz w:val="18"/>
+          <w:szCs w:val="18"/>
+        </w:rPr>
+        <w:t>ipynb</w:t>
+      </w:r>
+      <w:proofErr w:type="spellEnd"/>
+      <w:proofErr w:type="gramEnd"/>
+      <w:r>
+        <w:rPr>
+          <w:rFonts w:ascii="Aptos Display" w:eastAsia="Aptos Display" w:hAnsi="Aptos Display" w:cs="Aptos Display"/>
+          <w:sz w:val="18"/>
+          <w:szCs w:val="18"/>
+        </w:rPr>
+        <w:t xml:space="preserve"> file and any required dependencies to a newly created feature branch in the GitHub repository, and create a PR from that branch. Each branch should contain only </w:t>
+      </w:r>
+      <w:proofErr w:type="gramStart"/>
+      <w:r>
+        <w:rPr>
+          <w:rFonts w:ascii="Aptos Display" w:eastAsia="Aptos Display" w:hAnsi="Aptos Display" w:cs="Aptos Display"/>
+          <w:sz w:val="18"/>
+          <w:szCs w:val="18"/>
+        </w:rPr>
+        <w:t>one use</w:t>
+      </w:r>
+      <w:proofErr w:type="gramEnd"/>
+      <w:r>
+        <w:rPr>
+          <w:rFonts w:ascii="Aptos Display" w:eastAsia="Aptos Display" w:hAnsi="Aptos Display" w:cs="Aptos Display"/>
+          <w:sz w:val="18"/>
+          <w:szCs w:val="18"/>
+        </w:rPr>
+        <w:t xml:space="preserve"> case, and all updates for that use case should be pushed to the same branch and PR for easier tracking and management.</w:t>
       </w:r>
     </w:p>
     <w:p>
@@ -9861,7 +11709,31 @@
           <w:sz w:val="16"/>
           <w:szCs w:val="16"/>
         </w:rPr>
-        <w:t>: GitHub pull request showing the updated usecase, review status, and assigned reviewers.</w:t>
+        <w:t xml:space="preserve">: GitHub pull request showing the updated </w:t>
+      </w:r>
+      <w:proofErr w:type="spellStart"/>
+      <w:r>
+        <w:rPr>
+          <w:rFonts w:ascii="Aptos Display" w:eastAsia="Aptos Display" w:hAnsi="Aptos Display" w:cs="Aptos Display"/>
+          <w:i/>
+          <w:iCs/>
+          <w:color w:val="5B6470"/>
+          <w:sz w:val="16"/>
+          <w:szCs w:val="16"/>
+        </w:rPr>
+        <w:t>usecase</w:t>
+      </w:r>
+      <w:proofErr w:type="spellEnd"/>
+      <w:r>
+        <w:rPr>
+          <w:rFonts w:ascii="Aptos Display" w:eastAsia="Aptos Display" w:hAnsi="Aptos Display" w:cs="Aptos Display"/>
+          <w:i/>
+          <w:iCs/>
+          <w:color w:val="5B6470"/>
+          <w:sz w:val="16"/>
+          <w:szCs w:val="16"/>
+        </w:rPr>
+        <w:t>, review status, and assigned reviewers.</w:t>
       </w:r>
     </w:p>
     <w:p>
@@ -9877,8 +11749,16 @@
         <w:rPr>
           <w:rFonts w:eastAsia="Calibri"/>
         </w:rPr>
-        <w:t>Step 6 — Quality Manager re-reviews the updated usecase</w:t>
-      </w:r>
+        <w:t xml:space="preserve">Step 6 — Quality Manager re-reviews the updated </w:t>
+      </w:r>
+      <w:proofErr w:type="spellStart"/>
+      <w:r>
+        <w:rPr>
+          <w:rFonts w:eastAsia="Calibri"/>
+        </w:rPr>
+        <w:t>usecase</w:t>
+      </w:r>
+      <w:proofErr w:type="spellEnd"/>
     </w:p>
     <w:p>
       <w:pPr>
@@ -9999,7 +11879,31 @@
           <w:sz w:val="16"/>
           <w:szCs w:val="16"/>
         </w:rPr>
-        <w:t>Figure 4: Submit Reviews with Request changes in  Pull Request.</w:t>
+        <w:t xml:space="preserve">Figure 4: Submit Reviews with Request changes </w:t>
+      </w:r>
+      <w:proofErr w:type="gramStart"/>
+      <w:r>
+        <w:rPr>
+          <w:rFonts w:ascii="Aptos Display" w:eastAsia="Aptos Display" w:hAnsi="Aptos Display" w:cs="Aptos Display"/>
+          <w:i/>
+          <w:iCs/>
+          <w:color w:val="5B6470"/>
+          <w:sz w:val="16"/>
+          <w:szCs w:val="16"/>
+        </w:rPr>
+        <w:t>in  Pull</w:t>
+      </w:r>
+      <w:proofErr w:type="gramEnd"/>
+      <w:r>
+        <w:rPr>
+          <w:rFonts w:ascii="Aptos Display" w:eastAsia="Aptos Display" w:hAnsi="Aptos Display" w:cs="Aptos Display"/>
+          <w:i/>
+          <w:iCs/>
+          <w:color w:val="5B6470"/>
+          <w:sz w:val="16"/>
+          <w:szCs w:val="16"/>
+        </w:rPr>
+        <w:t xml:space="preserve"> Request.</w:t>
       </w:r>
     </w:p>
     <w:p>
@@ -10232,7 +12136,25 @@
           <w:sz w:val="18"/>
           <w:szCs w:val="18"/>
         </w:rPr>
-        <w:t>Template not followed - missing CSS styling, numbered headings, required descriptions. Insufficient explanation of what happens in the usecase.</w:t>
+        <w:t xml:space="preserve">Template not followed - missing CSS styling, numbered headings, required descriptions. Insufficient explanation of what happens in the </w:t>
+      </w:r>
+      <w:proofErr w:type="spellStart"/>
+      <w:r>
+        <w:rPr>
+          <w:rFonts w:asciiTheme="majorHAnsi" w:eastAsiaTheme="majorEastAsia" w:hAnsiTheme="majorHAnsi"/>
+          <w:sz w:val="18"/>
+          <w:szCs w:val="18"/>
+        </w:rPr>
+        <w:t>usecase</w:t>
+      </w:r>
+      <w:proofErr w:type="spellEnd"/>
+      <w:r>
+        <w:rPr>
+          <w:rFonts w:asciiTheme="majorHAnsi" w:eastAsiaTheme="majorEastAsia" w:hAnsiTheme="majorHAnsi"/>
+          <w:sz w:val="18"/>
+          <w:szCs w:val="18"/>
+        </w:rPr>
+        <w:t>.</w:t>
       </w:r>
     </w:p>
     <w:p>
@@ -10295,7 +12217,25 @@
           <w:szCs w:val="18"/>
         </w:rPr>
         <w:lastRenderedPageBreak/>
-        <w:t>No date/year in the usecase name.</w:t>
+        <w:t xml:space="preserve">No date/year in the </w:t>
+      </w:r>
+      <w:proofErr w:type="spellStart"/>
+      <w:r>
+        <w:rPr>
+          <w:rFonts w:asciiTheme="majorHAnsi" w:eastAsiaTheme="majorEastAsia" w:hAnsiTheme="majorHAnsi"/>
+          <w:sz w:val="18"/>
+          <w:szCs w:val="18"/>
+        </w:rPr>
+        <w:t>usecase</w:t>
+      </w:r>
+      <w:proofErr w:type="spellEnd"/>
+      <w:r>
+        <w:rPr>
+          <w:rFonts w:asciiTheme="majorHAnsi" w:eastAsiaTheme="majorEastAsia" w:hAnsiTheme="majorHAnsi"/>
+          <w:sz w:val="18"/>
+          <w:szCs w:val="18"/>
+        </w:rPr>
+        <w:t xml:space="preserve"> name.</w:t>
       </w:r>
     </w:p>
     <w:p>
@@ -10390,6 +12330,7 @@
         </w:rPr>
       </w:pPr>
       <w:bookmarkStart w:id="0" w:name="_Int_iLIgLEqq"/>
+      <w:proofErr w:type="gramStart"/>
       <w:r>
         <w:rPr>
           <w:rFonts w:asciiTheme="majorHAnsi" w:eastAsiaTheme="majorEastAsia" w:hAnsiTheme="majorHAnsi"/>
@@ -10399,6 +12340,7 @@
         <w:t>Input(</w:t>
       </w:r>
       <w:bookmarkEnd w:id="0"/>
+      <w:proofErr w:type="gramEnd"/>
       <w:r>
         <w:rPr>
           <w:rFonts w:asciiTheme="majorHAnsi" w:eastAsiaTheme="majorEastAsia" w:hAnsiTheme="majorHAnsi"/>
@@ -10422,13 +12364,41 @@
           <w:szCs w:val="18"/>
         </w:rPr>
       </w:pPr>
-      <w:r>
-        <w:rPr>
-          <w:rFonts w:asciiTheme="majorHAnsi" w:eastAsiaTheme="majorEastAsia" w:hAnsiTheme="majorHAnsi"/>
-          <w:sz w:val="18"/>
-          <w:szCs w:val="18"/>
-        </w:rPr>
-        <w:t xml:space="preserve">Usecase does not link back to the problem stated in the scenario throughout the analysis and conclusion of the usecase. </w:t>
+      <w:proofErr w:type="spellStart"/>
+      <w:r>
+        <w:rPr>
+          <w:rFonts w:asciiTheme="majorHAnsi" w:eastAsiaTheme="majorEastAsia" w:hAnsiTheme="majorHAnsi"/>
+          <w:sz w:val="18"/>
+          <w:szCs w:val="18"/>
+        </w:rPr>
+        <w:t>Usecase</w:t>
+      </w:r>
+      <w:proofErr w:type="spellEnd"/>
+      <w:r>
+        <w:rPr>
+          <w:rFonts w:asciiTheme="majorHAnsi" w:eastAsiaTheme="majorEastAsia" w:hAnsiTheme="majorHAnsi"/>
+          <w:sz w:val="18"/>
+          <w:szCs w:val="18"/>
+        </w:rPr>
+        <w:t xml:space="preserve"> does not link back to the problem stated in the scenario throughout the analysis and conclusion of the </w:t>
+      </w:r>
+      <w:proofErr w:type="spellStart"/>
+      <w:r>
+        <w:rPr>
+          <w:rFonts w:asciiTheme="majorHAnsi" w:eastAsiaTheme="majorEastAsia" w:hAnsiTheme="majorHAnsi"/>
+          <w:sz w:val="18"/>
+          <w:szCs w:val="18"/>
+        </w:rPr>
+        <w:t>usecase</w:t>
+      </w:r>
+      <w:proofErr w:type="spellEnd"/>
+      <w:r>
+        <w:rPr>
+          <w:rFonts w:asciiTheme="majorHAnsi" w:eastAsiaTheme="majorEastAsia" w:hAnsiTheme="majorHAnsi"/>
+          <w:sz w:val="18"/>
+          <w:szCs w:val="18"/>
+        </w:rPr>
+        <w:t xml:space="preserve">. </w:t>
       </w:r>
     </w:p>
     <w:p>
@@ -10789,8 +12759,6 @@
           <w:szCs w:val="18"/>
         </w:rPr>
       </w:pPr>
-      <w:commentRangeStart w:id="1"/>
-      <w:commentRangeStart w:id="2"/>
       <w:r>
         <w:rPr>
           <w:rFonts w:asciiTheme="majorHAnsi" w:eastAsiaTheme="majorEastAsia" w:hAnsiTheme="majorHAnsi"/>
@@ -10800,6 +12768,7 @@
         <w:t xml:space="preserve">Checklist Excel: </w:t>
       </w:r>
       <w:hyperlink r:id="rId29">
+        <w:proofErr w:type="spellStart"/>
         <w:r>
           <w:rPr>
             <w:rStyle w:val="Hyperlink"/>
@@ -10807,7 +12776,17 @@
             <w:sz w:val="18"/>
             <w:szCs w:val="18"/>
           </w:rPr>
-          <w:t>Usecase Quality Tracker</w:t>
+          <w:t>Usecase</w:t>
+        </w:r>
+        <w:proofErr w:type="spellEnd"/>
+        <w:r>
+          <w:rPr>
+            <w:rStyle w:val="Hyperlink"/>
+            <w:rFonts w:asciiTheme="majorHAnsi" w:eastAsiaTheme="majorEastAsia" w:hAnsiTheme="majorHAnsi"/>
+            <w:sz w:val="18"/>
+            <w:szCs w:val="18"/>
+          </w:rPr>
+          <w:t xml:space="preserve"> Quality Tracker</w:t>
         </w:r>
       </w:hyperlink>
       <w:r>
@@ -10932,7 +12911,31 @@
           <w:sz w:val="16"/>
           <w:szCs w:val="16"/>
         </w:rPr>
-        <w:t>: Checklist Excel — Usecase Quality Tracker, ‘QA Checklist V2’ is the review sheet.</w:t>
+        <w:t xml:space="preserve">: Checklist Excel — </w:t>
+      </w:r>
+      <w:proofErr w:type="spellStart"/>
+      <w:r>
+        <w:rPr>
+          <w:rFonts w:asciiTheme="majorHAnsi" w:eastAsiaTheme="majorEastAsia" w:hAnsiTheme="majorHAnsi"/>
+          <w:i/>
+          <w:iCs/>
+          <w:color w:val="5B6470"/>
+          <w:sz w:val="16"/>
+          <w:szCs w:val="16"/>
+        </w:rPr>
+        <w:t>Usecase</w:t>
+      </w:r>
+      <w:proofErr w:type="spellEnd"/>
+      <w:r>
+        <w:rPr>
+          <w:rFonts w:asciiTheme="majorHAnsi" w:eastAsiaTheme="majorEastAsia" w:hAnsiTheme="majorHAnsi"/>
+          <w:i/>
+          <w:iCs/>
+          <w:color w:val="5B6470"/>
+          <w:sz w:val="16"/>
+          <w:szCs w:val="16"/>
+        </w:rPr>
+        <w:t xml:space="preserve"> Quality Tracker, ‘QA Checklist V2’ is the review sheet.</w:t>
       </w:r>
     </w:p>
     <w:p>
@@ -10958,6 +12961,7 @@
         <w:t xml:space="preserve">GitHub repository (notebooks): </w:t>
       </w:r>
       <w:hyperlink r:id="rId31">
+        <w:proofErr w:type="spellStart"/>
         <w:r>
           <w:rPr>
             <w:rFonts w:asciiTheme="majorHAnsi" w:eastAsiaTheme="majorEastAsia" w:hAnsiTheme="majorHAnsi"/>
@@ -10968,6 +12972,7 @@
           </w:rPr>
           <w:t>github-usecases</w:t>
         </w:r>
+        <w:proofErr w:type="spellEnd"/>
       </w:hyperlink>
     </w:p>
     <w:p>
@@ -11084,7 +13089,31 @@
           <w:sz w:val="16"/>
           <w:szCs w:val="16"/>
         </w:rPr>
-        <w:t>: GitHub repository (notebooks) — github-usecases.</w:t>
+        <w:t xml:space="preserve">: GitHub repository (notebooks) — </w:t>
+      </w:r>
+      <w:proofErr w:type="spellStart"/>
+      <w:r>
+        <w:rPr>
+          <w:rFonts w:asciiTheme="majorHAnsi" w:eastAsiaTheme="majorEastAsia" w:hAnsiTheme="majorHAnsi"/>
+          <w:i/>
+          <w:iCs/>
+          <w:color w:val="5B6470"/>
+          <w:sz w:val="16"/>
+          <w:szCs w:val="16"/>
+        </w:rPr>
+        <w:t>github-usecases</w:t>
+      </w:r>
+      <w:proofErr w:type="spellEnd"/>
+      <w:r>
+        <w:rPr>
+          <w:rFonts w:asciiTheme="majorHAnsi" w:eastAsiaTheme="majorEastAsia" w:hAnsiTheme="majorHAnsi"/>
+          <w:i/>
+          <w:iCs/>
+          <w:color w:val="5B6470"/>
+          <w:sz w:val="16"/>
+          <w:szCs w:val="16"/>
+        </w:rPr>
+        <w:t>.</w:t>
       </w:r>
     </w:p>
     <w:p>
@@ -11107,7 +13136,25 @@
           <w:sz w:val="18"/>
           <w:szCs w:val="18"/>
         </w:rPr>
-        <w:t xml:space="preserve">MOP usecase template (required format): </w:t>
+        <w:t xml:space="preserve">MOP </w:t>
+      </w:r>
+      <w:proofErr w:type="spellStart"/>
+      <w:r>
+        <w:rPr>
+          <w:rFonts w:asciiTheme="majorHAnsi" w:eastAsiaTheme="majorEastAsia" w:hAnsiTheme="majorHAnsi"/>
+          <w:sz w:val="18"/>
+          <w:szCs w:val="18"/>
+        </w:rPr>
+        <w:t>usecase</w:t>
+      </w:r>
+      <w:proofErr w:type="spellEnd"/>
+      <w:r>
+        <w:rPr>
+          <w:rFonts w:asciiTheme="majorHAnsi" w:eastAsiaTheme="majorEastAsia" w:hAnsiTheme="majorHAnsi"/>
+          <w:sz w:val="18"/>
+          <w:szCs w:val="18"/>
+        </w:rPr>
+        <w:t xml:space="preserve"> template (required format): </w:t>
       </w:r>
       <w:hyperlink r:id="rId33">
         <w:r>
@@ -11117,29 +13164,29 @@
             <w:sz w:val="18"/>
             <w:szCs w:val="18"/>
           </w:rPr>
-          <w:t>MOP usecase-TEMPLATE</w:t>
+          <w:t xml:space="preserve">MOP </w:t>
+        </w:r>
+        <w:proofErr w:type="spellStart"/>
+        <w:r>
+          <w:rPr>
+            <w:rStyle w:val="Hyperlink"/>
+            <w:rFonts w:asciiTheme="majorHAnsi" w:eastAsiaTheme="majorEastAsia" w:hAnsiTheme="majorHAnsi"/>
+            <w:sz w:val="18"/>
+            <w:szCs w:val="18"/>
+          </w:rPr>
+          <w:t>usecase</w:t>
+        </w:r>
+        <w:proofErr w:type="spellEnd"/>
+        <w:r>
+          <w:rPr>
+            <w:rStyle w:val="Hyperlink"/>
+            <w:rFonts w:asciiTheme="majorHAnsi" w:eastAsiaTheme="majorEastAsia" w:hAnsiTheme="majorHAnsi"/>
+            <w:sz w:val="18"/>
+            <w:szCs w:val="18"/>
+          </w:rPr>
+          <w:t>-TEMPLATE</w:t>
         </w:r>
       </w:hyperlink>
-      <w:commentRangeEnd w:id="1"/>
-      <w:r>
-        <w:rPr>
-          <w:rStyle w:val="CommentReference"/>
-          <w:rFonts w:asciiTheme="majorHAnsi" w:eastAsiaTheme="majorEastAsia" w:hAnsiTheme="majorHAnsi"/>
-          <w:sz w:val="18"/>
-          <w:szCs w:val="18"/>
-        </w:rPr>
-        <w:commentReference w:id="1"/>
-      </w:r>
-      <w:commentRangeEnd w:id="2"/>
-      <w:r>
-        <w:rPr>
-          <w:rStyle w:val="CommentReference"/>
-          <w:rFonts w:asciiTheme="majorHAnsi" w:eastAsiaTheme="majorEastAsia" w:hAnsiTheme="majorHAnsi"/>
-          <w:sz w:val="18"/>
-          <w:szCs w:val="18"/>
-        </w:rPr>
-        <w:commentReference w:id="2"/>
-      </w:r>
     </w:p>
     <w:p>
       <w:pPr>
@@ -11172,7 +13219,7 @@
                     <pic:cNvPicPr/>
                   </pic:nvPicPr>
                   <pic:blipFill>
-                    <a:blip r:embed="rId38">
+                    <a:blip r:embed="rId34">
                       <a:extLst>
                         <a:ext uri="{28A0092B-C50C-407E-A947-70E740481C1C}">
                           <a14:useLocalDpi xmlns:a14="http://schemas.microsoft.com/office/drawing/2010/main"/>
@@ -11254,7 +13301,55 @@
           <w:sz w:val="16"/>
           <w:szCs w:val="16"/>
         </w:rPr>
-        <w:t>: MOP usecase template (required format) — MOP usecase-TEMPLATE.</w:t>
+        <w:t xml:space="preserve">: MOP </w:t>
+      </w:r>
+      <w:proofErr w:type="spellStart"/>
+      <w:r>
+        <w:rPr>
+          <w:rFonts w:asciiTheme="majorHAnsi" w:eastAsiaTheme="majorEastAsia" w:hAnsiTheme="majorHAnsi"/>
+          <w:i/>
+          <w:iCs/>
+          <w:color w:val="5B6470"/>
+          <w:sz w:val="16"/>
+          <w:szCs w:val="16"/>
+        </w:rPr>
+        <w:t>usecase</w:t>
+      </w:r>
+      <w:proofErr w:type="spellEnd"/>
+      <w:r>
+        <w:rPr>
+          <w:rFonts w:asciiTheme="majorHAnsi" w:eastAsiaTheme="majorEastAsia" w:hAnsiTheme="majorHAnsi"/>
+          <w:i/>
+          <w:iCs/>
+          <w:color w:val="5B6470"/>
+          <w:sz w:val="16"/>
+          <w:szCs w:val="16"/>
+        </w:rPr>
+        <w:t xml:space="preserve"> template (required format) — MOP </w:t>
+      </w:r>
+      <w:proofErr w:type="spellStart"/>
+      <w:r>
+        <w:rPr>
+          <w:rFonts w:asciiTheme="majorHAnsi" w:eastAsiaTheme="majorEastAsia" w:hAnsiTheme="majorHAnsi"/>
+          <w:i/>
+          <w:iCs/>
+          <w:color w:val="5B6470"/>
+          <w:sz w:val="16"/>
+          <w:szCs w:val="16"/>
+        </w:rPr>
+        <w:t>usecase</w:t>
+      </w:r>
+      <w:proofErr w:type="spellEnd"/>
+      <w:r>
+        <w:rPr>
+          <w:rFonts w:asciiTheme="majorHAnsi" w:eastAsiaTheme="majorEastAsia" w:hAnsiTheme="majorHAnsi"/>
+          <w:i/>
+          <w:iCs/>
+          <w:color w:val="5B6470"/>
+          <w:sz w:val="16"/>
+          <w:szCs w:val="16"/>
+        </w:rPr>
+        <w:t>-TEMPLATE.</w:t>
       </w:r>
     </w:p>
     <w:p>
@@ -11279,7 +13374,7 @@
         </w:rPr>
         <w:t xml:space="preserve">Microsoft Teams Planner: </w:t>
       </w:r>
-      <w:hyperlink r:id="rId39" w:history="1">
+      <w:hyperlink r:id="rId35" w:history="1">
         <w:r>
           <w:rPr>
             <w:rStyle w:val="Hyperlink"/>
@@ -11324,7 +13419,7 @@
                     <pic:cNvPicPr/>
                   </pic:nvPicPr>
                   <pic:blipFill>
-                    <a:blip r:embed="rId40"/>
+                    <a:blip r:embed="rId36"/>
                     <a:stretch>
                       <a:fillRect/>
                     </a:stretch>
@@ -11412,14 +13507,14 @@
           <w:rFonts w:eastAsia="Calibri"/>
         </w:rPr>
       </w:pPr>
-      <w:bookmarkStart w:id="3" w:name="_Appendix_A:_Domain"/>
+      <w:bookmarkStart w:id="1" w:name="_Appendix_A:_Domain"/>
       <w:r>
         <w:rPr>
           <w:rFonts w:eastAsia="Calibri"/>
         </w:rPr>
         <w:t>Appendix A: Domain Selection Guide</w:t>
       </w:r>
-      <w:bookmarkEnd w:id="3"/>
+      <w:bookmarkEnd w:id="1"/>
     </w:p>
     <w:p>
       <w:pPr>
@@ -11450,7 +13545,25 @@
           <w:sz w:val="18"/>
           <w:szCs w:val="18"/>
         </w:rPr>
-        <w:t xml:space="preserve"> in QA Checklist V2. Select one domain only: choose the domain that best reflects the usecase’s primary scenario, analysis, and intended outcome.</w:t>
+        <w:t xml:space="preserve"> in QA Checklist V2. Select one domain only: choose the domain that best reflects the </w:t>
+      </w:r>
+      <w:proofErr w:type="spellStart"/>
+      <w:r>
+        <w:rPr>
+          <w:rFonts w:asciiTheme="majorHAnsi" w:eastAsiaTheme="majorEastAsia" w:hAnsiTheme="majorHAnsi" w:cstheme="majorBidi"/>
+          <w:sz w:val="18"/>
+          <w:szCs w:val="18"/>
+        </w:rPr>
+        <w:t>usecase’s</w:t>
+      </w:r>
+      <w:proofErr w:type="spellEnd"/>
+      <w:r>
+        <w:rPr>
+          <w:rFonts w:asciiTheme="majorHAnsi" w:eastAsiaTheme="majorEastAsia" w:hAnsiTheme="majorHAnsi" w:cstheme="majorBidi"/>
+          <w:sz w:val="18"/>
+          <w:szCs w:val="18"/>
+        </w:rPr>
+        <w:t xml:space="preserve"> primary scenario, analysis, and intended outcome.</w:t>
       </w:r>
     </w:p>
     <w:p>
@@ -11566,7 +13679,29 @@
                 <w:sz w:val="18"/>
                 <w:szCs w:val="18"/>
               </w:rPr>
-              <w:t>Select the domain that the usecase focuses on…</w:t>
+              <w:t xml:space="preserve">Select the domain that the </w:t>
+            </w:r>
+            <w:proofErr w:type="spellStart"/>
+            <w:r>
+              <w:rPr>
+                <w:rFonts w:asciiTheme="majorHAnsi" w:eastAsiaTheme="majorEastAsia" w:hAnsiTheme="majorHAnsi"/>
+                <w:b/>
+                <w:color w:val="FFFFFF"/>
+                <w:sz w:val="18"/>
+                <w:szCs w:val="18"/>
+              </w:rPr>
+              <w:t>usecase</w:t>
+            </w:r>
+            <w:proofErr w:type="spellEnd"/>
+            <w:r>
+              <w:rPr>
+                <w:rFonts w:asciiTheme="majorHAnsi" w:eastAsiaTheme="majorEastAsia" w:hAnsiTheme="majorHAnsi"/>
+                <w:b/>
+                <w:color w:val="FFFFFF"/>
+                <w:sz w:val="18"/>
+                <w:szCs w:val="18"/>
+              </w:rPr>
+              <w:t xml:space="preserve"> focuses on…</w:t>
             </w:r>
           </w:p>
         </w:tc>
@@ -11599,8 +13734,20 @@
                 <w:sz w:val="18"/>
                 <w:szCs w:val="18"/>
               </w:rPr>
-              <w:t>Example usecase</w:t>
-            </w:r>
+              <w:t xml:space="preserve">Example </w:t>
+            </w:r>
+            <w:proofErr w:type="spellStart"/>
+            <w:r>
+              <w:rPr>
+                <w:rFonts w:asciiTheme="majorHAnsi" w:eastAsiaTheme="majorEastAsia" w:hAnsiTheme="majorHAnsi"/>
+                <w:b/>
+                <w:color w:val="FFFFFF"/>
+                <w:sz w:val="18"/>
+                <w:szCs w:val="18"/>
+              </w:rPr>
+              <w:t>usecase</w:t>
+            </w:r>
+            <w:proofErr w:type="spellEnd"/>
           </w:p>
         </w:tc>
       </w:tr>
@@ -12627,8 +14774,8 @@
       </w:r>
     </w:p>
     <w:sectPr>
-      <w:headerReference w:type="default" r:id="rId41"/>
-      <w:footerReference w:type="default" r:id="rId42"/>
+      <w:headerReference w:type="default" r:id="rId37"/>
+      <w:footerReference w:type="default" r:id="rId38"/>
       <w:pgSz w:w="11906" w:h="16838"/>
       <w:pgMar w:top="1100" w:right="1200" w:bottom="1100" w:left="1200" w:header="708" w:footer="708" w:gutter="0"/>
       <w:cols w:space="720"/>
@@ -12636,64 +14783,6 @@
     </w:sectPr>
   </w:body>
 </w:document>
-</file>
-
-<file path=word/comments.xml><?xml version="1.0" encoding="utf-8"?>
-<w:comments xmlns:wpc="http://schemas.microsoft.com/office/word/2010/wordprocessingCanvas" xmlns:cx="http://schemas.microsoft.com/office/drawing/2014/chartex" xmlns:cx1="http://schemas.microsoft.com/office/drawing/2015/9/8/chartex" xmlns:cx2="http://schemas.microsoft.com/office/drawing/2015/10/21/chartex" xmlns:cx3="http://schemas.microsoft.com/office/drawing/2016/5/9/chartex" xmlns:cx4="http://schemas.microsoft.com/office/drawing/2016/5/10/chartex" xmlns:cx5="http://schemas.microsoft.com/office/drawing/2016/5/11/chartex" xmlns:cx6="http://schemas.microsoft.com/office/drawing/2016/5/12/chartex" xmlns:cx7="http://schemas.microsoft.com/office/drawing/2016/5/13/chartex" xmlns:cx8="http://schemas.microsoft.com/office/drawing/2016/5/14/chartex" xmlns:mc="http://schemas.openxmlformats.org/markup-compatibility/2006" xmlns:m="http://schemas.openxmlformats.org/officeDocument/2006/math" xmlns:aink="http://schemas.microsoft.com/office/drawing/2016/ink" xmlns:am3d="http://schemas.microsoft.com/office/drawing/2017/model3d" xmlns:oel="http://schemas.microsoft.com/office/2019/extlst" xmlns:r="http://schemas.openxmlformats.org/officeDocument/2006/relationships" xmlns:wp14="http://schemas.microsoft.com/office/word/2010/wordprocessingDrawing" xmlns:wp="http://schemas.openxmlformats.org/drawingml/2006/wordprocessingDrawing" xmlns:wpg="http://schemas.microsoft.com/office/word/2010/wordprocessingGroup" xmlns:wpi="http://schemas.microsoft.com/office/word/2010/wordprocessingInk" xmlns:wps="http://schemas.microsoft.com/office/word/2010/wordprocessingShape" xmlns:o="urn:schemas-microsoft-com:office:office" xmlns:v="urn:schemas-microsoft-com:vml" xmlns:w10="urn:schemas-microsoft-com:office:word" xmlns:w="http://schemas.openxmlformats.org/wordprocessingml/2006/main" xmlns:w14="http://schemas.microsoft.com/office/word/2010/wordml" xmlns:w15="http://schemas.microsoft.com/office/word/2012/wordml" xmlns:w16cex="http://schemas.microsoft.com/office/word/2018/wordml/cex" xmlns:w16cid="http://schemas.microsoft.com/office/word/2016/wordml/cid" xmlns:w16="http://schemas.microsoft.com/office/word/2018/wordml" xmlns:w16sdtdh="http://schemas.microsoft.com/office/word/2020/wordml/sdtdatahash" xmlns:w16sdtfl="http://schemas.microsoft.com/office/word/2024/wordml/sdtformatlock" xmlns:w16se="http://schemas.microsoft.com/office/word/2015/wordml/symex" xmlns:w16du="http://schemas.microsoft.com/office/word/2023/wordml/word16du" xmlns:wne="http://schemas.microsoft.com/office/word/2006/wordml" mc:Ignorable="w14 w15 w16se w16cid w16 w16cex w16sdtdh w16sdtfl w16du wp14">
-  <w:comment w:id="1" w:author="Mollie Fernandez" w:date="2026-08-26T18:23:00Z" w:initials="MF">
-    <w:p>
-      <w:pPr>
-        <w:pStyle w:val="CommentText"/>
-      </w:pPr>
-      <w:r>
-        <w:rPr>
-          <w:rStyle w:val="CommentReference"/>
-        </w:rPr>
-        <w:annotationRef/>
-      </w:r>
-      <w:r>
-        <w:t>I think a screen shot of each of these would be good like the teams one</w:t>
-      </w:r>
-    </w:p>
-  </w:comment>
-  <w:comment w:id="2" w:author="XIAOLIN SITU" w:date="2026-09-03T12:24:00Z" w:initials="XS">
-    <w:p>
-      <w:pPr>
-        <w:pStyle w:val="CommentText"/>
-      </w:pPr>
-      <w:r>
-        <w:rPr>
-          <w:rStyle w:val="CommentReference"/>
-        </w:rPr>
-        <w:annotationRef/>
-      </w:r>
-      <w:r>
-        <w:t>Done</w:t>
-      </w:r>
-    </w:p>
-  </w:comment>
-</w:comments>
-</file>
-
-<file path=word/commentsExtended.xml><?xml version="1.0" encoding="utf-8"?>
-<w15:commentsEx xmlns:wpc="http://schemas.microsoft.com/office/word/2010/wordprocessingCanvas" xmlns:cx="http://schemas.microsoft.com/office/drawing/2014/chartex" xmlns:cx1="http://schemas.microsoft.com/office/drawing/2015/9/8/chartex" xmlns:cx2="http://schemas.microsoft.com/office/drawing/2015/10/21/chartex" xmlns:cx3="http://schemas.microsoft.com/office/drawing/2016/5/9/chartex" xmlns:cx4="http://schemas.microsoft.com/office/drawing/2016/5/10/chartex" xmlns:cx5="http://schemas.microsoft.com/office/drawing/2016/5/11/chartex" xmlns:cx6="http://schemas.microsoft.com/office/drawing/2016/5/12/chartex" xmlns:cx7="http://schemas.microsoft.com/office/drawing/2016/5/13/chartex" xmlns:cx8="http://schemas.microsoft.com/office/drawing/2016/5/14/chartex" xmlns:mc="http://schemas.openxmlformats.org/markup-compatibility/2006" xmlns:m="http://schemas.openxmlformats.org/officeDocument/2006/math" xmlns:aink="http://schemas.microsoft.com/office/drawing/2016/ink" xmlns:am3d="http://schemas.microsoft.com/office/drawing/2017/model3d" xmlns:oel="http://schemas.microsoft.com/office/2019/extlst" xmlns:r="http://schemas.openxmlformats.org/officeDocument/2006/relationships" xmlns:wp14="http://schemas.microsoft.com/office/word/2010/wordprocessingDrawing" xmlns:wp="http://schemas.openxmlformats.org/drawingml/2006/wordprocessingDrawing" xmlns:wpg="http://schemas.microsoft.com/office/word/2010/wordprocessingGroup" xmlns:wpi="http://schemas.microsoft.com/office/word/2010/wordprocessingInk" xmlns:wps="http://schemas.microsoft.com/office/word/2010/wordprocessingShape" xmlns:o="urn:schemas-microsoft-com:office:office" xmlns:v="urn:schemas-microsoft-com:vml" xmlns:w10="urn:schemas-microsoft-com:office:word" xmlns:w="http://schemas.openxmlformats.org/wordprocessingml/2006/main" xmlns:w14="http://schemas.microsoft.com/office/word/2010/wordml" xmlns:w15="http://schemas.microsoft.com/office/word/2012/wordml" xmlns:w16cex="http://schemas.microsoft.com/office/word/2018/wordml/cex" xmlns:w16cid="http://schemas.microsoft.com/office/word/2016/wordml/cid" xmlns:w16="http://schemas.microsoft.com/office/word/2018/wordml" xmlns:w16sdtdh="http://schemas.microsoft.com/office/word/2020/wordml/sdtdatahash" xmlns:w16sdtfl="http://schemas.microsoft.com/office/word/2024/wordml/sdtformatlock" xmlns:w16se="http://schemas.microsoft.com/office/word/2015/wordml/symex" xmlns:w16du="http://schemas.microsoft.com/office/word/2023/wordml/word16du" xmlns:wne="http://schemas.microsoft.com/office/word/2006/wordml" mc:Ignorable="w14 w15 w16se w16cid w16 w16cex w16sdtdh w16sdtfl w16du wp14">
-  <w15:commentEx w15:paraId="4619DBD0" w15:done="1"/>
-  <w15:commentEx w15:paraId="21409A7E" w15:paraIdParent="4619DBD0" w15:done="1"/>
-</w15:commentsEx>
-</file>
-
-<file path=word/commentsExtensible.xml><?xml version="1.0" encoding="utf-8"?>
-<w16cex:commentsExtensible xmlns:wpc="http://schemas.microsoft.com/office/word/2010/wordprocessingCanvas" xmlns:cx="http://schemas.microsoft.com/office/drawing/2014/chartex" xmlns:cx1="http://schemas.microsoft.com/office/drawing/2015/9/8/chartex" xmlns:cx2="http://schemas.microsoft.com/office/drawing/2015/10/21/chartex" xmlns:cx3="http://schemas.microsoft.com/office/drawing/2016/5/9/chartex" xmlns:cx4="http://schemas.microsoft.com/office/drawing/2016/5/10/chartex" xmlns:cx5="http://schemas.microsoft.com/office/drawing/2016/5/11/chartex" xmlns:cx6="http://schemas.microsoft.com/office/drawing/2016/5/12/chartex" xmlns:cx7="http://schemas.microsoft.com/office/drawing/2016/5/13/chartex" xmlns:cx8="http://schemas.microsoft.com/office/drawing/2016/5/14/chartex" xmlns:cr="http://schemas.microsoft.com/office/comments/2020/reactions" xmlns:mc="http://schemas.openxmlformats.org/markup-compatibility/2006" xmlns:m="http://schemas.openxmlformats.org/officeDocument/2006/math" xmlns:aink="http://schemas.microsoft.com/office/drawing/2016/ink" xmlns:am3d="http://schemas.microsoft.com/office/drawing/2017/model3d" xmlns:oel="http://schemas.microsoft.com/office/2019/extlst" xmlns:r="http://schemas.openxmlformats.org/officeDocument/2006/relationships" xmlns:wp14="http://schemas.microsoft.com/office/word/2010/wordprocessingDrawing" xmlns:wp="http://schemas.openxmlformats.org/drawingml/2006/wordprocessingDrawing" xmlns:wpg="http://schemas.microsoft.com/office/word/2010/wordprocessingGroup" xmlns:wpi="http://schemas.microsoft.com/office/word/2010/wordprocessingInk" xmlns:wps="http://schemas.microsoft.com/office/word/2010/wordprocessingShape" xmlns:o="urn:schemas-microsoft-com:office:office" xmlns:v="urn:schemas-microsoft-com:vml" xmlns:w10="urn:schemas-microsoft-com:office:word" xmlns:w="http://schemas.openxmlformats.org/wordprocessingml/2006/main" xmlns:w14="http://schemas.microsoft.com/office/word/2010/wordml" xmlns:w15="http://schemas.microsoft.com/office/word/2012/wordml" xmlns:w16cex="http://schemas.microsoft.com/office/word/2018/wordml/cex" xmlns:w16cid="http://schemas.microsoft.com/office/word/2016/wordml/cid" xmlns:w16="http://schemas.microsoft.com/office/word/2018/wordml" xmlns:w16sdtdh="http://schemas.microsoft.com/office/word/2020/wordml/sdtdatahash" xmlns:w16sdtfl="http://schemas.microsoft.com/office/word/2024/wordml/sdtformatlock" xmlns:w16se="http://schemas.microsoft.com/office/word/2015/wordml/symex" xmlns:w16du="http://schemas.microsoft.com/office/word/2023/wordml/word16du" xmlns:wne="http://schemas.microsoft.com/office/word/2006/wordml" mc:Ignorable="w14 w15 w16se w16cid w16 w16cex w16sdtdh w16sdtfl cr w16du wp14">
-  <w16cex:commentExtensible w16cex:durableId="2810269C" w16cex:dateUtc="2026-08-26T08:23:00Z"/>
-  <w16cex:commentExtensible w16cex:durableId="7AFE0FE8" w16cex:dateUtc="2026-09-03T02:24:00Z"/>
-</w16cex:commentsExtensible>
-</file>
-
-<file path=word/commentsIds.xml><?xml version="1.0" encoding="utf-8"?>
-<w16cid:commentsIds xmlns:wpc="http://schemas.microsoft.com/office/word/2010/wordprocessingCanvas" xmlns:cx="http://schemas.microsoft.com/office/drawing/2014/chartex" xmlns:cx1="http://schemas.microsoft.com/office/drawing/2015/9/8/chartex" xmlns:cx2="http://schemas.microsoft.com/office/drawing/2015/10/21/chartex" xmlns:cx3="http://schemas.microsoft.com/office/drawing/2016/5/9/chartex" xmlns:cx4="http://schemas.microsoft.com/office/drawing/2016/5/10/chartex" xmlns:cx5="http://schemas.microsoft.com/office/drawing/2016/5/11/chartex" xmlns:cx6="http://schemas.microsoft.com/office/drawing/2016/5/12/chartex" xmlns:cx7="http://schemas.microsoft.com/office/drawing/2016/5/13/chartex" xmlns:cx8="http://schemas.microsoft.com/office/drawing/2016/5/14/chartex" xmlns:mc="http://schemas.openxmlformats.org/markup-compatibility/2006" xmlns:m="http://schemas.openxmlformats.org/officeDocument/2006/math" xmlns:aink="http://schemas.microsoft.com/office/drawing/2016/ink" xmlns:am3d="http://schemas.microsoft.com/office/drawing/2017/model3d" xmlns:oel="http://schemas.microsoft.com/office/2019/extlst" xmlns:r="http://schemas.openxmlformats.org/officeDocument/2006/relationships" xmlns:wp14="http://schemas.microsoft.com/office/word/2010/wordprocessingDrawing" xmlns:wp="http://schemas.openxmlformats.org/drawingml/2006/wordprocessingDrawing" xmlns:wpg="http://schemas.microsoft.com/office/word/2010/wordprocessingGroup" xmlns:wpi="http://schemas.microsoft.com/office/word/2010/wordprocessingInk" xmlns:wps="http://schemas.microsoft.com/office/word/2010/wordprocessingShape" xmlns:o="urn:schemas-microsoft-com:office:office" xmlns:v="urn:schemas-microsoft-com:vml" xmlns:w10="urn:schemas-microsoft-com:office:word" xmlns:w="http://schemas.openxmlformats.org/wordprocessingml/2006/main" xmlns:w14="http://schemas.microsoft.com/office/word/2010/wordml" xmlns:w15="http://schemas.microsoft.com/office/word/2012/wordml" xmlns:w16cex="http://schemas.microsoft.com/office/word/2018/wordml/cex" xmlns:w16cid="http://schemas.microsoft.com/office/word/2016/wordml/cid" xmlns:w16="http://schemas.microsoft.com/office/word/2018/wordml" xmlns:w16sdtdh="http://schemas.microsoft.com/office/word/2020/wordml/sdtdatahash" xmlns:w16sdtfl="http://schemas.microsoft.com/office/word/2024/wordml/sdtformatlock" xmlns:w16se="http://schemas.microsoft.com/office/word/2015/wordml/symex" xmlns:w16du="http://schemas.microsoft.com/office/word/2023/wordml/word16du" xmlns:wne="http://schemas.microsoft.com/office/word/2006/wordml" mc:Ignorable="w14 w15 w16se w16cid w16 w16cex w16sdtdh w16sdtfl w16du wp14">
-  <w16cid:commentId w16cid:paraId="4619DBD0" w16cid:durableId="2810269C"/>
-  <w16cid:commentId w16cid:paraId="21409A7E" w16cid:durableId="7AFE0FE8"/>
-</w16cid:commentsIds>
 </file>
 
 <file path=word/endnotes.xml><?xml version="1.0" encoding="utf-8"?>
@@ -12829,9 +14918,9 @@
         <w:noProof/>
       </w:rPr>
       <w:drawing>
-        <wp:inline distT="0" distB="0" distL="0" distR="0" wp14:anchorId="71B891DC" wp14:editId="62638232">
+        <wp:inline distT="0" distB="0" distL="0" distR="0" wp14:anchorId="71B891DC" wp14:editId="3BEAD869">
           <wp:extent cx="6029325" cy="666750"/>
-          <wp:effectExtent l="0" t="0" r="0" b="0"/>
+          <wp:effectExtent l="0" t="0" r="3175" b="0"/>
           <wp:docPr id="1728456447" name="drawing"/>
           <wp:cNvGraphicFramePr>
             <a:graphicFrameLocks xmlns:a="http://schemas.openxmlformats.org/drawingml/2006/main" noChangeAspect="1"/>
@@ -12858,7 +14947,7 @@
                 <pic:spPr>
                   <a:xfrm>
                     <a:off x="0" y="0"/>
-                    <a:ext cx="6029325" cy="666750"/>
+                    <a:ext cx="6084541" cy="672856"/>
                   </a:xfrm>
                   <a:prstGeom prst="rect">
                     <a:avLst/>
@@ -15614,17 +17703,6 @@
     <w:abstractNumId w:val="11"/>
   </w:num>
 </w:numbering>
-</file>
-
-<file path=word/people.xml><?xml version="1.0" encoding="utf-8"?>
-<w15:people xmlns:wpc="http://schemas.microsoft.com/office/word/2010/wordprocessingCanvas" xmlns:cx="http://schemas.microsoft.com/office/drawing/2014/chartex" xmlns:cx1="http://schemas.microsoft.com/office/drawing/2015/9/8/chartex" xmlns:cx2="http://schemas.microsoft.com/office/drawing/2015/10/21/chartex" xmlns:cx3="http://schemas.microsoft.com/office/drawing/2016/5/9/chartex" xmlns:cx4="http://schemas.microsoft.com/office/drawing/2016/5/10/chartex" xmlns:cx5="http://schemas.microsoft.com/office/drawing/2016/5/11/chartex" xmlns:cx6="http://schemas.microsoft.com/office/drawing/2016/5/12/chartex" xmlns:cx7="http://schemas.microsoft.com/office/drawing/2016/5/13/chartex" xmlns:cx8="http://schemas.microsoft.com/office/drawing/2016/5/14/chartex" xmlns:mc="http://schemas.openxmlformats.org/markup-compatibility/2006" xmlns:m="http://schemas.openxmlformats.org/officeDocument/2006/math" xmlns:aink="http://schemas.microsoft.com/office/drawing/2016/ink" xmlns:am3d="http://schemas.microsoft.com/office/drawing/2017/model3d" xmlns:oel="http://schemas.microsoft.com/office/2019/extlst" xmlns:r="http://schemas.openxmlformats.org/officeDocument/2006/relationships" xmlns:wp14="http://schemas.microsoft.com/office/word/2010/wordprocessingDrawing" xmlns:wp="http://schemas.openxmlformats.org/drawingml/2006/wordprocessingDrawing" xmlns:wpg="http://schemas.microsoft.com/office/word/2010/wordprocessingGroup" xmlns:wpi="http://schemas.microsoft.com/office/word/2010/wordprocessingInk" xmlns:wps="http://schemas.microsoft.com/office/word/2010/wordprocessingShape" xmlns:o="urn:schemas-microsoft-com:office:office" xmlns:v="urn:schemas-microsoft-com:vml" xmlns:w10="urn:schemas-microsoft-com:office:word" xmlns:w="http://schemas.openxmlformats.org/wordprocessingml/2006/main" xmlns:w14="http://schemas.microsoft.com/office/word/2010/wordml" xmlns:w15="http://schemas.microsoft.com/office/word/2012/wordml" xmlns:w16cex="http://schemas.microsoft.com/office/word/2018/wordml/cex" xmlns:w16cid="http://schemas.microsoft.com/office/word/2016/wordml/cid" xmlns:w16="http://schemas.microsoft.com/office/word/2018/wordml" xmlns:w16sdtdh="http://schemas.microsoft.com/office/word/2020/wordml/sdtdatahash" xmlns:w16sdtfl="http://schemas.microsoft.com/office/word/2024/wordml/sdtformatlock" xmlns:w16se="http://schemas.microsoft.com/office/word/2015/wordml/symex" xmlns:w16du="http://schemas.microsoft.com/office/word/2023/wordml/word16du" xmlns:wne="http://schemas.microsoft.com/office/word/2006/wordml" mc:Ignorable="w14 w15 w16se w16cid w16 w16cex w16sdtdh w16sdtfl w16du wp14">
-  <w15:person w15:author="Mollie Fernandez">
-    <w15:presenceInfo w15:providerId="AD" w15:userId="S::m.fernandez@deakin.edu.au::ee1eafe3-46d8-4414-9f6d-1d67aa3b9524"/>
-  </w15:person>
-  <w15:person w15:author="XIAOLIN SITU">
-    <w15:presenceInfo w15:providerId="AD" w15:userId="S::s224251967@deakin.edu.au::18a728a1-a491-4050-a44c-f66a4ad4d207"/>
-  </w15:person>
-</w15:people>
 </file>
 
 <file path=word/styles.xml><?xml version="1.0" encoding="utf-8"?>

</xml_diff>